<commit_message>
Update Sustainable Computing Report Tianwei Lu.docx
</commit_message>
<xml_diff>
--- a/Sustainable Computing Report Tianwei Lu.docx
+++ b/Sustainable Computing Report Tianwei Lu.docx
@@ -104,18 +104,42 @@
         <w:rPr>
           <w:b/>
           <w:bCs/>
+          <w:sz w:val="22"/>
+          <w:szCs w:val="22"/>
         </w:rPr>
       </w:pPr>
       <w:r>
         <w:rPr>
           <w:b/>
           <w:bCs/>
+          <w:sz w:val="22"/>
+          <w:szCs w:val="22"/>
         </w:rPr>
         <w:t>Datasets</w:t>
+      </w:r>
+      <w:r>
+        <w:rPr>
+          <w:b/>
+          <w:bCs/>
+          <w:sz w:val="22"/>
+          <w:szCs w:val="22"/>
+        </w:rPr>
+        <w:t xml:space="preserve"> and measurements</w:t>
       </w:r>
     </w:p>
     <w:p>
-      <w:r>
+      <w:pPr>
+        <w:spacing w:line="480" w:lineRule="auto"/>
+        <w:rPr>
+          <w:sz w:val="22"/>
+          <w:szCs w:val="22"/>
+        </w:rPr>
+      </w:pPr>
+      <w:r>
+        <w:rPr>
+          <w:sz w:val="22"/>
+          <w:szCs w:val="22"/>
+        </w:rPr>
         <w:t xml:space="preserve">Grid intensity data was sourced from </w:t>
       </w:r>
       <w:r>
@@ -125,7 +149,14 @@
           <w:sz w:val="22"/>
           <w:szCs w:val="22"/>
         </w:rPr>
-        <w:t>Historic generation mix and carbon intensity</w:t>
+        <w:t xml:space="preserve">Historic generation mix and carbon intensity </w:t>
+      </w:r>
+      <w:r>
+        <w:rPr>
+          <w:sz w:val="22"/>
+          <w:szCs w:val="22"/>
+        </w:rPr>
+        <w:t xml:space="preserve">[1] and real time carbon intensity is retrieved from </w:t>
       </w:r>
       <w:r>
         <w:rPr>
@@ -134,17 +165,21 @@
           <w:sz w:val="22"/>
           <w:szCs w:val="22"/>
         </w:rPr>
-        <w:t xml:space="preserve"> </w:t>
-      </w:r>
-      <w:r>
-        <w:rPr>
-          <w:sz w:val="22"/>
-          <w:szCs w:val="22"/>
-        </w:rPr>
-        <w:t xml:space="preserve">[1] </w:t>
-      </w:r>
-      <w:r>
-        <w:t xml:space="preserve">and real time carbon intensity is retrieved from </w:t>
+        <w:t>Carbon Intensity API</w:t>
+      </w:r>
+      <w:r>
+        <w:rPr>
+          <w:sz w:val="22"/>
+          <w:szCs w:val="22"/>
+        </w:rPr>
+        <w:t xml:space="preserve"> [2]</w:t>
+      </w:r>
+      <w:r>
+        <w:rPr>
+          <w:sz w:val="22"/>
+          <w:szCs w:val="22"/>
+        </w:rPr>
+        <w:t xml:space="preserve">, the power measurement is taken using an adapted version of </w:t>
       </w:r>
       <w:r>
         <w:rPr>
@@ -153,14 +188,14 @@
           <w:sz w:val="22"/>
           <w:szCs w:val="22"/>
         </w:rPr>
-        <w:t>Carbon Intensity API</w:t>
-      </w:r>
-      <w:r>
-        <w:rPr>
-          <w:sz w:val="22"/>
-          <w:szCs w:val="22"/>
-        </w:rPr>
-        <w:t xml:space="preserve"> [2].</w:t>
+        <w:t xml:space="preserve">LibreHardwareMonitor </w:t>
+      </w:r>
+      <w:r>
+        <w:rPr>
+          <w:sz w:val="22"/>
+          <w:szCs w:val="22"/>
+        </w:rPr>
+        <w:t>[3].</w:t>
       </w:r>
     </w:p>
     <w:p>
@@ -234,7 +269,39 @@
           <w:sz w:val="22"/>
           <w:szCs w:val="22"/>
         </w:rPr>
-        <w:t xml:space="preserve"> It is expected that it is quite suitable for higher time frame (monthly) predictions but will become quite computationally intensive for hourly predictions, as we are looking at longer cycles, for example weeks with time steps of 168, the maximum likelihood fitting function in SARIMA will be exponentially complex with the size of this seasonal period.</w:t>
+        <w:t xml:space="preserve"> It is expected that it is suitable for </w:t>
+      </w:r>
+      <w:r>
+        <w:rPr>
+          <w:rFonts w:eastAsia="DengXian" w:cs="Times New Roman"/>
+          <w:sz w:val="22"/>
+          <w:szCs w:val="22"/>
+        </w:rPr>
+        <w:t>monthly</w:t>
+      </w:r>
+      <w:r>
+        <w:rPr>
+          <w:rFonts w:eastAsia="DengXian" w:cs="Times New Roman"/>
+          <w:sz w:val="22"/>
+          <w:szCs w:val="22"/>
+        </w:rPr>
+        <w:t xml:space="preserve"> predictions but will become computationally intensive for hourly predictions</w:t>
+      </w:r>
+      <w:r>
+        <w:rPr>
+          <w:rFonts w:eastAsia="DengXian" w:cs="Times New Roman"/>
+          <w:sz w:val="22"/>
+          <w:szCs w:val="22"/>
+        </w:rPr>
+        <w:t xml:space="preserve">, because </w:t>
+      </w:r>
+      <w:r>
+        <w:rPr>
+          <w:rFonts w:eastAsia="DengXian" w:cs="Times New Roman"/>
+          <w:sz w:val="22"/>
+          <w:szCs w:val="22"/>
+        </w:rPr>
+        <w:t>the maximum likelihood fitting function in SARIMA will be exponentially complex with the size of this seasonal period.</w:t>
       </w:r>
       <w:r>
         <w:rPr>
@@ -302,7 +369,23 @@
           <w:sz w:val="22"/>
           <w:szCs w:val="22"/>
         </w:rPr>
-        <w:t xml:space="preserve"> [3]</w:t>
+        <w:t xml:space="preserve"> [</w:t>
+      </w:r>
+      <w:r>
+        <w:rPr>
+          <w:rFonts w:eastAsia="DengXian" w:cs="Times New Roman"/>
+          <w:sz w:val="22"/>
+          <w:szCs w:val="22"/>
+        </w:rPr>
+        <w:t>4</w:t>
+      </w:r>
+      <w:r>
+        <w:rPr>
+          <w:rFonts w:eastAsia="DengXian" w:cs="Times New Roman"/>
+          <w:sz w:val="22"/>
+          <w:szCs w:val="22"/>
+        </w:rPr>
+        <w:t>]</w:t>
       </w:r>
       <w:r>
         <w:rPr>
@@ -368,6 +451,14 @@
           <w:szCs w:val="22"/>
         </w:rPr>
         <w:footnoteReference w:id="1"/>
+      </w:r>
+      <w:r>
+        <w:rPr>
+          <w:rFonts w:eastAsia="DengXian" w:cs="Times New Roman"/>
+          <w:sz w:val="22"/>
+          <w:szCs w:val="22"/>
+        </w:rPr>
+        <w:t>Generative AI is not used for programming this.</w:t>
       </w:r>
     </w:p>
     <w:p>
@@ -419,7 +510,27 @@
           <w:sz w:val="22"/>
           <w:szCs w:val="22"/>
         </w:rPr>
-        <w:t>multilayer perceptron (MLP)</w:t>
+        <w:t xml:space="preserve">multilayer </w:t>
+      </w:r>
+      <w:r>
+        <w:rPr>
+          <w:rFonts w:eastAsia="DengXian" w:cs="Times New Roman"/>
+          <w:b/>
+          <w:bCs/>
+          <w:sz w:val="22"/>
+          <w:szCs w:val="22"/>
+        </w:rPr>
+        <w:t>perceptron</w:t>
+      </w:r>
+      <w:r>
+        <w:rPr>
+          <w:rFonts w:eastAsia="DengXian" w:cs="Times New Roman"/>
+          <w:b/>
+          <w:bCs/>
+          <w:sz w:val="22"/>
+          <w:szCs w:val="22"/>
+        </w:rPr>
+        <w:t xml:space="preserve"> (MLP)</w:t>
       </w:r>
     </w:p>
     <w:p>
@@ -437,15 +548,47 @@
           <w:sz w:val="22"/>
           <w:szCs w:val="22"/>
         </w:rPr>
-        <w:t>The MLP neural network has been selected for forecasting</w:t>
-      </w:r>
-      <w:r>
-        <w:rPr>
-          <w:rFonts w:eastAsia="DengXian" w:cs="Times New Roman"/>
-          <w:sz w:val="22"/>
-          <w:szCs w:val="22"/>
-        </w:rPr>
-        <w:t xml:space="preserve"> as it is able to take multiple inputs such as lags, time features and moving averages at the same time, we are able to supervise the model to strictly take the lags of certain time cycles (days or weeks or months) for an efficient learning process, as grid cycles tend to be strictly cyclic. It is expected to be scalable and suitable in all cases but will require a more complex network to learn hourly patterns.</w:t>
+        <w:t xml:space="preserve">The MLP neural network has been selected </w:t>
+      </w:r>
+      <w:r>
+        <w:rPr>
+          <w:rFonts w:eastAsia="DengXian" w:cs="Times New Roman"/>
+          <w:sz w:val="22"/>
+          <w:szCs w:val="22"/>
+        </w:rPr>
+        <w:t xml:space="preserve">as it is able to take multiple inputs such as lags, time features and moving </w:t>
+      </w:r>
+      <w:r>
+        <w:rPr>
+          <w:rFonts w:eastAsia="DengXian" w:cs="Times New Roman"/>
+          <w:sz w:val="22"/>
+          <w:szCs w:val="22"/>
+        </w:rPr>
+        <w:t xml:space="preserve">average </w:t>
+      </w:r>
+      <w:r>
+        <w:rPr>
+          <w:rFonts w:eastAsia="DengXian" w:cs="Times New Roman"/>
+          <w:sz w:val="22"/>
+          <w:szCs w:val="22"/>
+        </w:rPr>
+        <w:t xml:space="preserve">for an efficient learning process, as </w:t>
+      </w:r>
+      <w:r>
+        <w:rPr>
+          <w:rFonts w:eastAsia="DengXian" w:cs="Times New Roman"/>
+          <w:sz w:val="22"/>
+          <w:szCs w:val="22"/>
+        </w:rPr>
+        <w:t xml:space="preserve">power </w:t>
+      </w:r>
+      <w:r>
+        <w:rPr>
+          <w:rFonts w:eastAsia="DengXian" w:cs="Times New Roman"/>
+          <w:sz w:val="22"/>
+          <w:szCs w:val="22"/>
+        </w:rPr>
+        <w:t>grid cycles tend to be cyclic. It is expected to be scalable and suitable in all cases but will require a more complex network to learn hourly patterns.</w:t>
       </w:r>
       <w:r>
         <w:rPr>
@@ -489,7 +632,23 @@
           <w:sz w:val="22"/>
           <w:szCs w:val="22"/>
         </w:rPr>
-        <w:t>library [4].</w:t>
+        <w:t>library [</w:t>
+      </w:r>
+      <w:r>
+        <w:rPr>
+          <w:rFonts w:eastAsia="DengXian" w:cs="Times New Roman"/>
+          <w:sz w:val="22"/>
+          <w:szCs w:val="22"/>
+        </w:rPr>
+        <w:t>5</w:t>
+      </w:r>
+      <w:r>
+        <w:rPr>
+          <w:rFonts w:eastAsia="DengXian" w:cs="Times New Roman"/>
+          <w:sz w:val="22"/>
+          <w:szCs w:val="22"/>
+        </w:rPr>
+        <w:t>].</w:t>
       </w:r>
     </w:p>
     <w:p>
@@ -515,12 +674,12 @@
     <w:tbl>
       <w:tblPr>
         <w:tblStyle w:val="TableGrid"/>
-        <w:tblW w:w="0" w:type="auto"/>
+        <w:tblW w:w="9634" w:type="dxa"/>
         <w:tblLook w:val="04A0" w:firstRow="1" w:lastRow="0" w:firstColumn="1" w:lastColumn="0" w:noHBand="0" w:noVBand="1"/>
       </w:tblPr>
       <w:tblGrid>
         <w:gridCol w:w="1726"/>
-        <w:gridCol w:w="7200"/>
+        <w:gridCol w:w="7908"/>
       </w:tblGrid>
       <w:tr>
         <w:tc>
@@ -551,7 +710,7 @@
         </w:tc>
         <w:tc>
           <w:tcPr>
-            <w:tcW w:w="7200" w:type="dxa"/>
+            <w:tcW w:w="7908" w:type="dxa"/>
           </w:tcPr>
           <w:p>
             <w:pPr>
@@ -662,7 +821,7 @@
         </w:tc>
         <w:tc>
           <w:tcPr>
-            <w:tcW w:w="7200" w:type="dxa"/>
+            <w:tcW w:w="7908" w:type="dxa"/>
           </w:tcPr>
           <w:p>
             <w:pPr>
@@ -712,7 +871,7 @@
         </w:tc>
         <w:tc>
           <w:tcPr>
-            <w:tcW w:w="7200" w:type="dxa"/>
+            <w:tcW w:w="7908" w:type="dxa"/>
           </w:tcPr>
           <w:p>
             <w:pPr>
@@ -782,7 +941,7 @@
         </w:tc>
         <w:tc>
           <w:tcPr>
-            <w:tcW w:w="7200" w:type="dxa"/>
+            <w:tcW w:w="7908" w:type="dxa"/>
           </w:tcPr>
           <w:p>
             <w:pPr>
@@ -844,7 +1003,7 @@
       </w:tblPr>
       <w:tblGrid>
         <w:gridCol w:w="1726"/>
-        <w:gridCol w:w="7200"/>
+        <w:gridCol w:w="7851"/>
       </w:tblGrid>
       <w:tr>
         <w:tc>
@@ -875,7 +1034,7 @@
         </w:tc>
         <w:tc>
           <w:tcPr>
-            <w:tcW w:w="7200" w:type="dxa"/>
+            <w:tcW w:w="7851" w:type="dxa"/>
           </w:tcPr>
           <w:p>
             <w:pPr>
@@ -935,7 +1094,7 @@
         </w:tc>
         <w:tc>
           <w:tcPr>
-            <w:tcW w:w="7200" w:type="dxa"/>
+            <w:tcW w:w="7851" w:type="dxa"/>
           </w:tcPr>
           <w:p>
             <w:pPr>
@@ -985,7 +1144,7 @@
         </w:tc>
         <w:tc>
           <w:tcPr>
-            <w:tcW w:w="7200" w:type="dxa"/>
+            <w:tcW w:w="7851" w:type="dxa"/>
           </w:tcPr>
           <w:p>
             <w:pPr>
@@ -1029,6 +1188,7 @@
                 <w:sz w:val="18"/>
                 <w:szCs w:val="18"/>
               </w:rPr>
+              <w:lastRenderedPageBreak/>
               <w:t xml:space="preserve">Data </w:t>
             </w:r>
             <w:r>
@@ -1055,7 +1215,7 @@
         </w:tc>
         <w:tc>
           <w:tcPr>
-            <w:tcW w:w="7200" w:type="dxa"/>
+            <w:tcW w:w="7851" w:type="dxa"/>
           </w:tcPr>
           <w:p>
             <w:pPr>
@@ -1210,7 +1370,15 @@
           <w:sz w:val="22"/>
           <w:szCs w:val="22"/>
         </w:rPr>
-        <w:t>Multithreading can be applied at the feature engineering</w:t>
+        <w:t>m</w:t>
+      </w:r>
+      <w:r>
+        <w:rPr>
+          <w:rFonts w:eastAsia="DengXian" w:cs="Times New Roman"/>
+          <w:sz w:val="22"/>
+          <w:szCs w:val="22"/>
+        </w:rPr>
+        <w:t>ultithreading can be applied at the feature engineering</w:t>
       </w:r>
       <w:r>
         <w:rPr>
@@ -1226,15 +1394,63 @@
           <w:sz w:val="22"/>
           <w:szCs w:val="22"/>
         </w:rPr>
-        <w:t>step;</w:t>
-      </w:r>
-      <w:r>
-        <w:rPr>
-          <w:rFonts w:eastAsia="DengXian" w:cs="Times New Roman"/>
-          <w:sz w:val="22"/>
-          <w:szCs w:val="22"/>
-        </w:rPr>
-        <w:t xml:space="preserve"> the model training step uses the </w:t>
+        <w:t>step</w:t>
+      </w:r>
+      <w:r>
+        <w:rPr>
+          <w:rFonts w:eastAsia="DengXian" w:cs="Times New Roman"/>
+          <w:sz w:val="22"/>
+          <w:szCs w:val="22"/>
+        </w:rPr>
+        <w:t xml:space="preserve"> computing the time features in parallel</w:t>
+      </w:r>
+      <w:r>
+        <w:rPr>
+          <w:rFonts w:eastAsia="DengXian" w:cs="Times New Roman"/>
+          <w:sz w:val="22"/>
+          <w:szCs w:val="22"/>
+        </w:rPr>
+        <w:t>;</w:t>
+      </w:r>
+      <w:r>
+        <w:rPr>
+          <w:rFonts w:eastAsia="DengXian" w:cs="Times New Roman"/>
+          <w:sz w:val="22"/>
+          <w:szCs w:val="22"/>
+        </w:rPr>
+        <w:t xml:space="preserve"> model training </w:t>
+      </w:r>
+      <w:r>
+        <w:rPr>
+          <w:rFonts w:eastAsia="DengXian" w:cs="Times New Roman"/>
+          <w:sz w:val="22"/>
+          <w:szCs w:val="22"/>
+        </w:rPr>
+        <w:t>already</w:t>
+      </w:r>
+      <w:r>
+        <w:rPr>
+          <w:rFonts w:eastAsia="DengXian" w:cs="Times New Roman"/>
+          <w:sz w:val="22"/>
+          <w:szCs w:val="22"/>
+        </w:rPr>
+        <w:t xml:space="preserve"> use</w:t>
+      </w:r>
+      <w:r>
+        <w:rPr>
+          <w:rFonts w:eastAsia="DengXian" w:cs="Times New Roman"/>
+          <w:sz w:val="22"/>
+          <w:szCs w:val="22"/>
+        </w:rPr>
+        <w:t>s</w:t>
+      </w:r>
+      <w:r>
+        <w:rPr>
+          <w:rFonts w:eastAsia="DengXian" w:cs="Times New Roman"/>
+          <w:sz w:val="22"/>
+          <w:szCs w:val="22"/>
+        </w:rPr>
+        <w:t xml:space="preserve"> the </w:t>
       </w:r>
       <w:r>
         <w:rPr>
@@ -1252,7 +1468,320 @@
           <w:sz w:val="22"/>
           <w:szCs w:val="22"/>
         </w:rPr>
-        <w:t xml:space="preserve"> and </w:t>
+        <w:t xml:space="preserve"> </w:t>
+      </w:r>
+      <w:r>
+        <w:rPr>
+          <w:rFonts w:eastAsia="DengXian" w:cs="Times New Roman"/>
+          <w:sz w:val="22"/>
+          <w:szCs w:val="22"/>
+        </w:rPr>
+        <w:t>library [</w:t>
+      </w:r>
+      <w:r>
+        <w:rPr>
+          <w:rFonts w:eastAsia="DengXian" w:cs="Times New Roman"/>
+          <w:sz w:val="22"/>
+          <w:szCs w:val="22"/>
+        </w:rPr>
+        <w:t>6</w:t>
+      </w:r>
+      <w:r>
+        <w:rPr>
+          <w:rFonts w:eastAsia="DengXian" w:cs="Times New Roman"/>
+          <w:sz w:val="22"/>
+          <w:szCs w:val="22"/>
+        </w:rPr>
+        <w:t>]</w:t>
+      </w:r>
+      <w:r>
+        <w:rPr>
+          <w:rFonts w:eastAsia="DengXian" w:cs="Times New Roman"/>
+          <w:sz w:val="22"/>
+          <w:szCs w:val="22"/>
+        </w:rPr>
+        <w:t xml:space="preserve"> that already implement</w:t>
+      </w:r>
+      <w:r>
+        <w:rPr>
+          <w:rFonts w:eastAsia="DengXian" w:cs="Times New Roman"/>
+          <w:sz w:val="22"/>
+          <w:szCs w:val="22"/>
+        </w:rPr>
+        <w:t>s</w:t>
+      </w:r>
+      <w:r>
+        <w:rPr>
+          <w:rFonts w:eastAsia="DengXian" w:cs="Times New Roman"/>
+          <w:sz w:val="22"/>
+          <w:szCs w:val="22"/>
+        </w:rPr>
+        <w:t xml:space="preserve"> </w:t>
+      </w:r>
+      <w:r>
+        <w:rPr>
+          <w:rFonts w:eastAsia="DengXian" w:cs="Times New Roman"/>
+          <w:sz w:val="22"/>
+          <w:szCs w:val="22"/>
+        </w:rPr>
+        <w:t>multi-threading</w:t>
+      </w:r>
+      <w:r>
+        <w:rPr>
+          <w:rFonts w:eastAsia="DengXian" w:cs="Times New Roman"/>
+          <w:sz w:val="22"/>
+          <w:szCs w:val="22"/>
+        </w:rPr>
+        <w:t>.</w:t>
+      </w:r>
+    </w:p>
+    <w:p>
+      <w:pPr>
+        <w:spacing w:line="480" w:lineRule="auto"/>
+        <w:rPr>
+          <w:rFonts w:eastAsia="DengXian" w:cs="Times New Roman"/>
+          <w:b/>
+          <w:bCs/>
+          <w:sz w:val="22"/>
+          <w:szCs w:val="22"/>
+        </w:rPr>
+      </w:pPr>
+      <w:r>
+        <w:rPr>
+          <w:rFonts w:eastAsia="DengXian" w:cs="Times New Roman"/>
+          <w:b/>
+          <w:bCs/>
+          <w:sz w:val="22"/>
+          <w:szCs w:val="22"/>
+        </w:rPr>
+        <w:t>Operating on smaller datasets</w:t>
+      </w:r>
+    </w:p>
+    <w:p>
+      <w:pPr>
+        <w:spacing w:line="480" w:lineRule="auto"/>
+        <w:rPr>
+          <w:rFonts w:eastAsia="DengXian" w:cs="Times New Roman"/>
+          <w:sz w:val="22"/>
+          <w:szCs w:val="22"/>
+        </w:rPr>
+      </w:pPr>
+      <w:r>
+        <w:rPr>
+          <w:rFonts w:eastAsia="DengXian" w:cs="Times New Roman"/>
+          <w:sz w:val="22"/>
+          <w:szCs w:val="22"/>
+        </w:rPr>
+        <w:t xml:space="preserve">For the </w:t>
+      </w:r>
+      <w:r>
+        <w:rPr>
+          <w:rFonts w:eastAsia="DengXian" w:cs="Times New Roman"/>
+          <w:sz w:val="22"/>
+          <w:szCs w:val="22"/>
+        </w:rPr>
+        <w:t xml:space="preserve">hourly </w:t>
+      </w:r>
+      <w:r>
+        <w:rPr>
+          <w:rFonts w:eastAsia="DengXian" w:cs="Times New Roman"/>
+          <w:sz w:val="22"/>
+          <w:szCs w:val="22"/>
+        </w:rPr>
+        <w:t>SARIMA model, the subset has been reduced to 480 data points.</w:t>
+      </w:r>
+      <w:r>
+        <w:rPr>
+          <w:rFonts w:eastAsia="DengXian" w:cs="Times New Roman"/>
+          <w:sz w:val="22"/>
+          <w:szCs w:val="22"/>
+        </w:rPr>
+        <w:t xml:space="preserve"> For other models, it</w:t>
+      </w:r>
+      <w:r>
+        <w:rPr>
+          <w:rFonts w:eastAsia="DengXian" w:cs="Times New Roman"/>
+          <w:sz w:val="22"/>
+          <w:szCs w:val="22"/>
+        </w:rPr>
+        <w:t xml:space="preserve"> has been decided that data for time period 2009 to the end of 201</w:t>
+      </w:r>
+      <w:r>
+        <w:rPr>
+          <w:rFonts w:eastAsia="DengXian" w:cs="Times New Roman"/>
+          <w:sz w:val="22"/>
+          <w:szCs w:val="22"/>
+        </w:rPr>
+        <w:t>5</w:t>
+      </w:r>
+      <w:r>
+        <w:rPr>
+          <w:rFonts w:eastAsia="DengXian" w:cs="Times New Roman"/>
+          <w:sz w:val="22"/>
+          <w:szCs w:val="22"/>
+        </w:rPr>
+        <w:t xml:space="preserve"> to be irrelevant</w:t>
+      </w:r>
+      <w:r>
+        <w:rPr>
+          <w:rFonts w:eastAsia="DengXian" w:cs="Times New Roman"/>
+          <w:sz w:val="22"/>
+          <w:szCs w:val="22"/>
+        </w:rPr>
+        <w:t>.</w:t>
+      </w:r>
+      <w:r>
+        <w:rPr>
+          <w:rFonts w:eastAsia="DengXian" w:cs="Times New Roman"/>
+          <w:sz w:val="22"/>
+          <w:szCs w:val="22"/>
+        </w:rPr>
+        <w:t xml:space="preserve"> </w:t>
+      </w:r>
+      <w:r>
+        <w:rPr>
+          <w:rStyle w:val="FootnoteReference"/>
+          <w:rFonts w:eastAsia="DengXian" w:cs="Times New Roman"/>
+          <w:sz w:val="22"/>
+          <w:szCs w:val="22"/>
+        </w:rPr>
+        <w:footnoteReference w:id="2"/>
+      </w:r>
+    </w:p>
+    <w:p>
+      <w:pPr>
+        <w:spacing w:line="480" w:lineRule="auto"/>
+        <w:rPr>
+          <w:rFonts w:eastAsia="DengXian" w:cs="Times New Roman"/>
+          <w:b/>
+          <w:bCs/>
+          <w:sz w:val="22"/>
+          <w:szCs w:val="22"/>
+        </w:rPr>
+      </w:pPr>
+      <w:r>
+        <w:rPr>
+          <w:rFonts w:eastAsia="DengXian" w:cs="Times New Roman"/>
+          <w:b/>
+          <w:bCs/>
+          <w:sz w:val="22"/>
+          <w:szCs w:val="22"/>
+        </w:rPr>
+        <w:t>Improving bottlenecks</w:t>
+      </w:r>
+    </w:p>
+    <w:p>
+      <w:pPr>
+        <w:spacing w:line="480" w:lineRule="auto"/>
+        <w:rPr>
+          <w:rFonts w:eastAsia="DengXian" w:cs="Times New Roman"/>
+          <w:sz w:val="22"/>
+          <w:szCs w:val="22"/>
+        </w:rPr>
+      </w:pPr>
+      <w:r>
+        <w:rPr>
+          <w:rFonts w:eastAsia="DengXian" w:cs="Times New Roman"/>
+          <w:sz w:val="22"/>
+          <w:szCs w:val="22"/>
+        </w:rPr>
+        <w:t>There</w:t>
+      </w:r>
+      <w:r>
+        <w:rPr>
+          <w:rFonts w:eastAsia="DengXian" w:cs="Times New Roman"/>
+          <w:sz w:val="22"/>
+          <w:szCs w:val="22"/>
+        </w:rPr>
+        <w:t xml:space="preserve"> are two </w:t>
+      </w:r>
+      <w:r>
+        <w:rPr>
+          <w:rFonts w:eastAsia="DengXian" w:cs="Times New Roman"/>
+          <w:sz w:val="22"/>
+          <w:szCs w:val="22"/>
+        </w:rPr>
+        <w:t>major run time intensive sections, reading</w:t>
+      </w:r>
+      <w:r>
+        <w:rPr>
+          <w:rFonts w:eastAsia="DengXian" w:cs="Times New Roman"/>
+          <w:sz w:val="22"/>
+          <w:szCs w:val="22"/>
+        </w:rPr>
+        <w:t xml:space="preserve"> the </w:t>
+      </w:r>
+      <w:r>
+        <w:rPr>
+          <w:rFonts w:eastAsia="DengXian" w:cs="Times New Roman"/>
+          <w:sz w:val="22"/>
+          <w:szCs w:val="22"/>
+        </w:rPr>
+        <w:t xml:space="preserve">csv file </w:t>
+      </w:r>
+      <w:r>
+        <w:rPr>
+          <w:rFonts w:eastAsia="DengXian" w:cs="Times New Roman"/>
+          <w:sz w:val="22"/>
+          <w:szCs w:val="22"/>
+        </w:rPr>
+        <w:t xml:space="preserve">and fitting the models. </w:t>
+      </w:r>
+      <w:r>
+        <w:rPr>
+          <w:rFonts w:eastAsia="DengXian" w:cs="Times New Roman"/>
+          <w:sz w:val="22"/>
+          <w:szCs w:val="22"/>
+        </w:rPr>
+        <w:t xml:space="preserve">The </w:t>
+      </w:r>
+      <w:r>
+        <w:rPr>
+          <w:rFonts w:eastAsia="DengXian" w:cs="Times New Roman"/>
+          <w:sz w:val="22"/>
+          <w:szCs w:val="22"/>
+        </w:rPr>
+        <w:t xml:space="preserve">csv file can be directly compiled to </w:t>
+      </w:r>
+      <w:r>
+        <w:rPr>
+          <w:rFonts w:eastAsia="DengXian" w:cs="Times New Roman"/>
+          <w:sz w:val="22"/>
+          <w:szCs w:val="22"/>
+        </w:rPr>
+        <w:t>parquet</w:t>
+      </w:r>
+      <w:r>
+        <w:rPr>
+          <w:rFonts w:eastAsia="DengXian" w:cs="Times New Roman"/>
+          <w:sz w:val="22"/>
+          <w:szCs w:val="22"/>
+        </w:rPr>
+        <w:t>.</w:t>
+      </w:r>
+      <w:r>
+        <w:rPr>
+          <w:rFonts w:eastAsia="DengXian" w:cs="Times New Roman"/>
+          <w:sz w:val="22"/>
+          <w:szCs w:val="22"/>
+        </w:rPr>
+        <w:t xml:space="preserve"> </w:t>
+      </w:r>
+      <w:r>
+        <w:rPr>
+          <w:rFonts w:eastAsia="DengXian" w:cs="Times New Roman"/>
+          <w:sz w:val="22"/>
+          <w:szCs w:val="22"/>
+        </w:rPr>
+        <w:t>T</w:t>
+      </w:r>
+      <w:r>
+        <w:rPr>
+          <w:rFonts w:eastAsia="DengXian" w:cs="Times New Roman"/>
+          <w:sz w:val="22"/>
+          <w:szCs w:val="22"/>
+        </w:rPr>
+        <w:t xml:space="preserve">he </w:t>
       </w:r>
       <w:r>
         <w:rPr>
@@ -1262,404 +1791,112 @@
           <w:sz w:val="22"/>
           <w:szCs w:val="22"/>
         </w:rPr>
-        <w:t>NumPy</w:t>
-      </w:r>
-      <w:r>
-        <w:rPr>
-          <w:rFonts w:eastAsia="DengXian" w:cs="Times New Roman"/>
-          <w:sz w:val="22"/>
-          <w:szCs w:val="22"/>
-        </w:rPr>
-        <w:t xml:space="preserve"> libraries that already implement </w:t>
-      </w:r>
-      <w:r>
-        <w:rPr>
-          <w:rFonts w:eastAsia="DengXian" w:cs="Times New Roman"/>
-          <w:sz w:val="22"/>
-          <w:szCs w:val="22"/>
-        </w:rPr>
-        <w:t>multi-threading</w:t>
-      </w:r>
-      <w:r>
-        <w:rPr>
-          <w:rFonts w:eastAsia="DengXian" w:cs="Times New Roman"/>
-          <w:sz w:val="22"/>
-          <w:szCs w:val="22"/>
-        </w:rPr>
-        <w:t xml:space="preserve"> optimally.</w:t>
+        <w:t>resample</w:t>
+      </w:r>
+      <w:r>
+        <w:rPr>
+          <w:rFonts w:eastAsia="DengXian" w:cs="Times New Roman"/>
+          <w:sz w:val="22"/>
+          <w:szCs w:val="22"/>
+        </w:rPr>
+        <w:t xml:space="preserve"> method to month can be conducted on the hourly datase</w:t>
+      </w:r>
+      <w:r>
+        <w:rPr>
+          <w:rFonts w:eastAsia="DengXian" w:cs="Times New Roman"/>
+          <w:sz w:val="22"/>
+          <w:szCs w:val="22"/>
+        </w:rPr>
+        <w:t>t</w:t>
+      </w:r>
+      <w:r>
+        <w:rPr>
+          <w:rFonts w:eastAsia="DengXian" w:cs="Times New Roman"/>
+          <w:sz w:val="22"/>
+          <w:szCs w:val="22"/>
+        </w:rPr>
+        <w:t>.</w:t>
+      </w:r>
+      <w:r>
+        <w:rPr>
+          <w:rFonts w:eastAsia="DengXian" w:cs="Times New Roman"/>
+          <w:sz w:val="22"/>
+          <w:szCs w:val="22"/>
+        </w:rPr>
+        <w:t xml:space="preserve"> </w:t>
+      </w:r>
+      <w:r>
+        <w:rPr>
+          <w:rFonts w:eastAsia="DengXian" w:cs="Times New Roman"/>
+          <w:sz w:val="22"/>
+          <w:szCs w:val="22"/>
+        </w:rPr>
+        <w:t xml:space="preserve">The fitting </w:t>
+      </w:r>
+      <w:r>
+        <w:rPr>
+          <w:rFonts w:eastAsia="DengXian" w:cs="Times New Roman"/>
+          <w:sz w:val="22"/>
+          <w:szCs w:val="22"/>
+        </w:rPr>
+        <w:t xml:space="preserve">for SARIMA can be accelerated </w:t>
+      </w:r>
+      <w:r>
+        <w:rPr>
+          <w:rFonts w:eastAsia="DengXian" w:cs="Times New Roman"/>
+          <w:sz w:val="22"/>
+          <w:szCs w:val="22"/>
+        </w:rPr>
+        <w:t>by using Fourier variables</w:t>
+      </w:r>
+      <w:r>
+        <w:rPr>
+          <w:rFonts w:eastAsia="DengXian" w:cs="Times New Roman"/>
+          <w:sz w:val="22"/>
+          <w:szCs w:val="22"/>
+        </w:rPr>
+        <w:t>;</w:t>
+      </w:r>
+      <w:r>
+        <w:rPr>
+          <w:rFonts w:eastAsia="DengXian" w:cs="Times New Roman"/>
+          <w:sz w:val="22"/>
+          <w:szCs w:val="22"/>
+        </w:rPr>
+        <w:t xml:space="preserve"> </w:t>
+      </w:r>
+      <w:r>
+        <w:rPr>
+          <w:rFonts w:eastAsia="DengXian" w:cs="Times New Roman"/>
+          <w:sz w:val="22"/>
+          <w:szCs w:val="22"/>
+        </w:rPr>
+        <w:t xml:space="preserve">MLP model can be accelerated by </w:t>
+      </w:r>
+      <w:r>
+        <w:rPr>
+          <w:rFonts w:eastAsia="DengXian" w:cs="Times New Roman"/>
+          <w:sz w:val="22"/>
+          <w:szCs w:val="22"/>
+        </w:rPr>
+        <w:t>increasing the batch size.</w:t>
+      </w:r>
+      <w:r>
+        <w:rPr>
+          <w:rStyle w:val="FootnoteReference"/>
+          <w:rFonts w:eastAsia="DengXian" w:cs="Times New Roman"/>
+          <w:sz w:val="22"/>
+          <w:szCs w:val="22"/>
+        </w:rPr>
+        <w:footnoteReference w:id="3"/>
       </w:r>
     </w:p>
     <w:p>
       <w:pPr>
-        <w:spacing w:line="480" w:lineRule="auto"/>
-        <w:rPr>
-          <w:rFonts w:eastAsia="DengXian" w:cs="Times New Roman"/>
-          <w:b/>
-          <w:bCs/>
-          <w:sz w:val="22"/>
-          <w:szCs w:val="22"/>
-        </w:rPr>
-      </w:pPr>
-      <w:r>
-        <w:rPr>
-          <w:rFonts w:eastAsia="DengXian" w:cs="Times New Roman"/>
-          <w:b/>
-          <w:bCs/>
-          <w:sz w:val="22"/>
-          <w:szCs w:val="22"/>
-        </w:rPr>
-        <w:t>Operating on smaller datasets:</w:t>
-      </w:r>
-    </w:p>
-    <w:p>
-      <w:pPr>
-        <w:spacing w:line="480" w:lineRule="auto"/>
-        <w:rPr>
-          <w:rFonts w:eastAsia="DengXian" w:cs="Times New Roman"/>
-          <w:sz w:val="22"/>
-          <w:szCs w:val="22"/>
-        </w:rPr>
-      </w:pPr>
-      <w:r>
-        <w:rPr>
-          <w:rFonts w:eastAsia="DengXian" w:cs="Times New Roman"/>
-          <w:sz w:val="22"/>
-          <w:szCs w:val="22"/>
-        </w:rPr>
-        <w:t xml:space="preserve">For the </w:t>
-      </w:r>
-      <w:r>
-        <w:rPr>
-          <w:rFonts w:eastAsia="DengXian" w:cs="Times New Roman"/>
-          <w:sz w:val="22"/>
-          <w:szCs w:val="22"/>
-        </w:rPr>
-        <w:t xml:space="preserve">hourly </w:t>
-      </w:r>
-      <w:r>
-        <w:rPr>
-          <w:rFonts w:eastAsia="DengXian" w:cs="Times New Roman"/>
-          <w:sz w:val="22"/>
-          <w:szCs w:val="22"/>
-        </w:rPr>
-        <w:t>SARIMA model, the subset has been reduced to 480 data points.</w:t>
-      </w:r>
-      <w:r>
-        <w:rPr>
-          <w:rFonts w:eastAsia="DengXian" w:cs="Times New Roman"/>
-          <w:sz w:val="22"/>
-          <w:szCs w:val="22"/>
-        </w:rPr>
-        <w:t xml:space="preserve"> For other models, it</w:t>
-      </w:r>
-      <w:r>
-        <w:rPr>
-          <w:rFonts w:eastAsia="DengXian" w:cs="Times New Roman"/>
-          <w:sz w:val="22"/>
-          <w:szCs w:val="22"/>
-        </w:rPr>
-        <w:t xml:space="preserve"> has been decided that data for time period 2009 to the end of 201</w:t>
-      </w:r>
-      <w:r>
-        <w:rPr>
-          <w:rFonts w:eastAsia="DengXian" w:cs="Times New Roman"/>
-          <w:sz w:val="22"/>
-          <w:szCs w:val="22"/>
-        </w:rPr>
-        <w:t>5</w:t>
-      </w:r>
-      <w:r>
-        <w:rPr>
-          <w:rFonts w:eastAsia="DengXian" w:cs="Times New Roman"/>
-          <w:sz w:val="22"/>
-          <w:szCs w:val="22"/>
-        </w:rPr>
-        <w:t xml:space="preserve"> to be irrelevant</w:t>
-      </w:r>
-      <w:r>
-        <w:rPr>
-          <w:rFonts w:eastAsia="DengXian" w:cs="Times New Roman"/>
-          <w:sz w:val="22"/>
-          <w:szCs w:val="22"/>
-        </w:rPr>
-        <w:t>.</w:t>
-      </w:r>
-      <w:r>
-        <w:rPr>
-          <w:rFonts w:eastAsia="DengXian" w:cs="Times New Roman"/>
-          <w:sz w:val="22"/>
-          <w:szCs w:val="22"/>
-        </w:rPr>
-        <w:t xml:space="preserve"> </w:t>
-      </w:r>
-      <w:r>
-        <w:rPr>
-          <w:rStyle w:val="FootnoteReference"/>
-          <w:rFonts w:eastAsia="DengXian" w:cs="Times New Roman"/>
-          <w:sz w:val="22"/>
-          <w:szCs w:val="22"/>
-        </w:rPr>
-        <w:footnoteReference w:id="2"/>
-      </w:r>
-    </w:p>
-    <w:p>
-      <w:pPr>
-        <w:spacing w:line="480" w:lineRule="auto"/>
-        <w:rPr>
-          <w:rFonts w:eastAsia="DengXian" w:cs="Times New Roman"/>
-          <w:b/>
-          <w:bCs/>
-          <w:sz w:val="22"/>
-          <w:szCs w:val="22"/>
-        </w:rPr>
-      </w:pPr>
-      <w:r>
-        <w:rPr>
-          <w:rFonts w:eastAsia="DengXian" w:cs="Times New Roman"/>
-          <w:b/>
-          <w:bCs/>
-          <w:sz w:val="22"/>
-          <w:szCs w:val="22"/>
-        </w:rPr>
-        <w:t>Improving bottlenecks</w:t>
-      </w:r>
-      <w:r>
-        <w:rPr>
-          <w:rFonts w:eastAsia="DengXian" w:cs="Times New Roman"/>
-          <w:b/>
-          <w:bCs/>
-          <w:sz w:val="22"/>
-          <w:szCs w:val="22"/>
-        </w:rPr>
-        <w:t>:</w:t>
-      </w:r>
-    </w:p>
-    <w:p>
-      <w:pPr>
-        <w:spacing w:line="480" w:lineRule="auto"/>
-        <w:rPr>
-          <w:rFonts w:eastAsia="DengXian" w:cs="Times New Roman"/>
-          <w:sz w:val="22"/>
-          <w:szCs w:val="22"/>
-        </w:rPr>
-      </w:pPr>
-      <w:r>
-        <w:rPr>
-          <w:rFonts w:eastAsia="DengXian" w:cs="Times New Roman"/>
-          <w:sz w:val="22"/>
-          <w:szCs w:val="22"/>
-        </w:rPr>
-        <w:t>There</w:t>
-      </w:r>
-      <w:r>
-        <w:rPr>
-          <w:rFonts w:eastAsia="DengXian" w:cs="Times New Roman"/>
-          <w:sz w:val="22"/>
-          <w:szCs w:val="22"/>
-        </w:rPr>
-        <w:t xml:space="preserve"> are two </w:t>
-      </w:r>
-      <w:r>
-        <w:rPr>
-          <w:rFonts w:eastAsia="DengXian" w:cs="Times New Roman"/>
-          <w:sz w:val="22"/>
-          <w:szCs w:val="22"/>
-        </w:rPr>
-        <w:t>major run time intensive sections, reading</w:t>
-      </w:r>
-      <w:r>
-        <w:rPr>
-          <w:rFonts w:eastAsia="DengXian" w:cs="Times New Roman"/>
-          <w:sz w:val="22"/>
-          <w:szCs w:val="22"/>
-        </w:rPr>
-        <w:t xml:space="preserve"> the </w:t>
-      </w:r>
-      <w:r>
-        <w:rPr>
-          <w:rFonts w:eastAsia="DengXian" w:cs="Times New Roman"/>
-          <w:sz w:val="22"/>
-          <w:szCs w:val="22"/>
-        </w:rPr>
-        <w:t xml:space="preserve">csv file </w:t>
-      </w:r>
-      <w:r>
-        <w:rPr>
-          <w:rFonts w:eastAsia="DengXian" w:cs="Times New Roman"/>
-          <w:sz w:val="22"/>
-          <w:szCs w:val="22"/>
-        </w:rPr>
-        <w:t xml:space="preserve">and fitting the models. </w:t>
-      </w:r>
-      <w:r>
-        <w:rPr>
-          <w:rFonts w:eastAsia="DengXian" w:cs="Times New Roman"/>
-          <w:sz w:val="22"/>
-          <w:szCs w:val="22"/>
-        </w:rPr>
-        <w:t xml:space="preserve">The </w:t>
-      </w:r>
-      <w:r>
-        <w:rPr>
-          <w:rFonts w:eastAsia="DengXian" w:cs="Times New Roman"/>
-          <w:sz w:val="22"/>
-          <w:szCs w:val="22"/>
-        </w:rPr>
-        <w:t xml:space="preserve">csv file can be directly compiled to </w:t>
-      </w:r>
-      <w:r>
-        <w:rPr>
-          <w:rFonts w:eastAsia="DengXian" w:cs="Times New Roman"/>
-          <w:sz w:val="22"/>
-          <w:szCs w:val="22"/>
-        </w:rPr>
-        <w:t>parquet</w:t>
-      </w:r>
-      <w:r>
-        <w:rPr>
-          <w:rFonts w:eastAsia="DengXian" w:cs="Times New Roman"/>
-          <w:sz w:val="22"/>
-          <w:szCs w:val="22"/>
-        </w:rPr>
-        <w:t>.</w:t>
-      </w:r>
-      <w:r>
-        <w:rPr>
-          <w:rFonts w:eastAsia="DengXian" w:cs="Times New Roman"/>
-          <w:sz w:val="22"/>
-          <w:szCs w:val="22"/>
-        </w:rPr>
-        <w:t xml:space="preserve"> </w:t>
-      </w:r>
-      <w:r>
-        <w:rPr>
-          <w:rFonts w:eastAsia="DengXian" w:cs="Times New Roman"/>
-          <w:sz w:val="22"/>
-          <w:szCs w:val="22"/>
-        </w:rPr>
-        <w:t>T</w:t>
-      </w:r>
-      <w:r>
-        <w:rPr>
-          <w:rFonts w:eastAsia="DengXian" w:cs="Times New Roman"/>
-          <w:sz w:val="22"/>
-          <w:szCs w:val="22"/>
-        </w:rPr>
-        <w:t xml:space="preserve">he </w:t>
-      </w:r>
-      <w:r>
-        <w:rPr>
-          <w:rFonts w:eastAsia="DengXian" w:cs="Times New Roman"/>
-          <w:i/>
-          <w:iCs/>
-          <w:sz w:val="22"/>
-          <w:szCs w:val="22"/>
-        </w:rPr>
-        <w:t>resample</w:t>
-      </w:r>
-      <w:r>
-        <w:rPr>
-          <w:rFonts w:eastAsia="DengXian" w:cs="Times New Roman"/>
-          <w:sz w:val="22"/>
-          <w:szCs w:val="22"/>
-        </w:rPr>
-        <w:t xml:space="preserve"> method to month can be conducted on the hourly datase</w:t>
-      </w:r>
-      <w:r>
-        <w:rPr>
-          <w:rFonts w:eastAsia="DengXian" w:cs="Times New Roman"/>
-          <w:sz w:val="22"/>
-          <w:szCs w:val="22"/>
-        </w:rPr>
-        <w:t>t</w:t>
-      </w:r>
-      <w:r>
-        <w:rPr>
-          <w:rFonts w:eastAsia="DengXian" w:cs="Times New Roman"/>
-          <w:sz w:val="22"/>
-          <w:szCs w:val="22"/>
-        </w:rPr>
-        <w:t>.</w:t>
-      </w:r>
-      <w:r>
-        <w:rPr>
-          <w:rFonts w:eastAsia="DengXian" w:cs="Times New Roman"/>
-          <w:sz w:val="22"/>
-          <w:szCs w:val="22"/>
-        </w:rPr>
-        <w:t xml:space="preserve"> </w:t>
-      </w:r>
-      <w:r>
-        <w:rPr>
-          <w:rFonts w:eastAsia="DengXian" w:cs="Times New Roman"/>
-          <w:sz w:val="22"/>
-          <w:szCs w:val="22"/>
-        </w:rPr>
-        <w:t xml:space="preserve">The fitting </w:t>
-      </w:r>
-      <w:r>
-        <w:rPr>
-          <w:rFonts w:eastAsia="DengXian" w:cs="Times New Roman"/>
-          <w:sz w:val="22"/>
-          <w:szCs w:val="22"/>
-        </w:rPr>
-        <w:t xml:space="preserve">for SARIMA can be accelerated </w:t>
-      </w:r>
-      <w:r>
-        <w:rPr>
-          <w:rFonts w:eastAsia="DengXian" w:cs="Times New Roman"/>
-          <w:sz w:val="22"/>
-          <w:szCs w:val="22"/>
-        </w:rPr>
-        <w:t>by using Fourier variables</w:t>
-      </w:r>
-      <w:r>
-        <w:rPr>
-          <w:rFonts w:eastAsia="DengXian" w:cs="Times New Roman"/>
-          <w:sz w:val="22"/>
-          <w:szCs w:val="22"/>
-        </w:rPr>
-        <w:t>;</w:t>
-      </w:r>
-      <w:r>
-        <w:rPr>
-          <w:rFonts w:eastAsia="DengXian" w:cs="Times New Roman"/>
-          <w:sz w:val="22"/>
-          <w:szCs w:val="22"/>
-        </w:rPr>
-        <w:t xml:space="preserve"> </w:t>
-      </w:r>
-      <w:r>
-        <w:rPr>
-          <w:rFonts w:eastAsia="DengXian" w:cs="Times New Roman"/>
-          <w:sz w:val="22"/>
-          <w:szCs w:val="22"/>
-        </w:rPr>
-        <w:t xml:space="preserve">MLP model can be accelerated by </w:t>
-      </w:r>
-      <w:r>
-        <w:rPr>
-          <w:rFonts w:eastAsia="DengXian" w:cs="Times New Roman"/>
-          <w:sz w:val="22"/>
-          <w:szCs w:val="22"/>
-        </w:rPr>
-        <w:t>increasing the batch size.</w:t>
-      </w:r>
-      <w:r>
-        <w:rPr>
-          <w:rStyle w:val="FootnoteReference"/>
-          <w:rFonts w:eastAsia="DengXian" w:cs="Times New Roman"/>
-          <w:sz w:val="22"/>
-          <w:szCs w:val="22"/>
-        </w:rPr>
-        <w:footnoteReference w:id="3"/>
-      </w:r>
-    </w:p>
-    <w:p>
-      <w:pPr>
+        <w:pStyle w:val="ListParagraph"/>
         <w:numPr>
           <w:ilvl w:val="0"/>
-          <w:numId w:val="2"/>
+          <w:numId w:val="1"/>
         </w:numPr>
         <w:spacing w:line="480" w:lineRule="auto"/>
         <w:outlineLvl w:val="0"/>
@@ -1685,22 +1922,15 @@
     <w:p>
       <w:pPr>
         <w:spacing w:line="480" w:lineRule="auto"/>
-        <w:outlineLvl w:val="0"/>
-        <w:rPr>
-          <w:rFonts w:eastAsia="DengXian" w:cs="Times New Roman"/>
+        <w:rPr>
           <w:b/>
           <w:bCs/>
-          <w:sz w:val="22"/>
-          <w:szCs w:val="22"/>
-        </w:rPr>
-      </w:pPr>
-      <w:r>
-        <w:rPr>
-          <w:rFonts w:eastAsia="DengXian" w:cs="Times New Roman"/>
+        </w:rPr>
+      </w:pPr>
+      <w:r>
+        <w:rPr>
           <w:b/>
           <w:bCs/>
-          <w:sz w:val="22"/>
-          <w:szCs w:val="22"/>
         </w:rPr>
         <w:t>Base models</w:t>
       </w:r>
@@ -2411,6 +2641,22 @@
       <w:pPr>
         <w:spacing w:line="480" w:lineRule="auto"/>
         <w:rPr>
+          <w:sz w:val="22"/>
+          <w:szCs w:val="22"/>
+        </w:rPr>
+      </w:pPr>
+      <w:r>
+        <w:rPr>
+          <w:sz w:val="22"/>
+          <w:szCs w:val="22"/>
+        </w:rPr>
+        <w:t>As expected, the hourly SARIMA forecast has performed poorly.</w:t>
+      </w:r>
+    </w:p>
+    <w:p>
+      <w:pPr>
+        <w:spacing w:line="480" w:lineRule="auto"/>
+        <w:rPr>
           <w:b/>
           <w:bCs/>
           <w:sz w:val="22"/>
@@ -2433,6 +2679,7 @@
         <w:keepNext/>
       </w:pPr>
       <w:r>
+        <w:lastRenderedPageBreak/>
         <w:t xml:space="preserve">Table </w:t>
       </w:r>
       <w:fldSimple w:instr=" SEQ Table \* ARABIC ">
@@ -2854,29 +3101,53 @@
                 <w:sz w:val="18"/>
                 <w:szCs w:val="18"/>
               </w:rPr>
-              <w:t>1.8597</w:t>
-            </w:r>
-          </w:p>
-        </w:tc>
-        <w:tc>
-          <w:tcPr>
-            <w:tcW w:w="0" w:type="auto"/>
-          </w:tcPr>
-          <w:p>
-            <w:pPr>
-              <w:rPr>
-                <w:rFonts w:eastAsia="DengXian" w:cs="Times New Roman"/>
-                <w:sz w:val="18"/>
-                <w:szCs w:val="18"/>
-              </w:rPr>
-            </w:pPr>
-            <w:r>
-              <w:rPr>
-                <w:rFonts w:eastAsia="DengXian" w:cs="Times New Roman"/>
-                <w:sz w:val="18"/>
-                <w:szCs w:val="18"/>
-              </w:rPr>
-              <w:t>91.79</w:t>
+              <w:t>1.</w:t>
+            </w:r>
+            <w:r>
+              <w:rPr>
+                <w:rFonts w:eastAsia="DengXian" w:cs="Times New Roman"/>
+                <w:sz w:val="18"/>
+                <w:szCs w:val="18"/>
+              </w:rPr>
+              <w:t>2</w:t>
+            </w:r>
+            <w:r>
+              <w:rPr>
+                <w:rFonts w:eastAsia="DengXian" w:cs="Times New Roman"/>
+                <w:sz w:val="18"/>
+                <w:szCs w:val="18"/>
+              </w:rPr>
+              <w:t>597</w:t>
+            </w:r>
+          </w:p>
+        </w:tc>
+        <w:tc>
+          <w:tcPr>
+            <w:tcW w:w="0" w:type="auto"/>
+          </w:tcPr>
+          <w:p>
+            <w:pPr>
+              <w:rPr>
+                <w:rFonts w:eastAsia="DengXian" w:cs="Times New Roman"/>
+                <w:sz w:val="18"/>
+                <w:szCs w:val="18"/>
+              </w:rPr>
+            </w:pPr>
+            <w:r>
+              <w:rPr>
+                <w:rFonts w:eastAsia="DengXian" w:cs="Times New Roman"/>
+                <w:sz w:val="18"/>
+                <w:szCs w:val="18"/>
+              </w:rPr>
+              <w:t>15</w:t>
+            </w:r>
+            <w:r>
+              <w:rPr>
+                <w:rFonts w:eastAsia="DengXian" w:cs="Times New Roman"/>
+                <w:sz w:val="18"/>
+                <w:szCs w:val="18"/>
+              </w:rPr>
+              <w:t>.79</w:t>
             </w:r>
           </w:p>
         </w:tc>
@@ -3070,7 +3341,6 @@
                 <w:sz w:val="18"/>
                 <w:szCs w:val="18"/>
               </w:rPr>
-              <w:lastRenderedPageBreak/>
               <w:t>Hourly MLP</w:t>
             </w:r>
           </w:p>
@@ -3159,7 +3429,23 @@
                 <w:sz w:val="18"/>
                 <w:szCs w:val="18"/>
               </w:rPr>
-              <w:t>1626.06</w:t>
+              <w:t>1</w:t>
+            </w:r>
+            <w:r>
+              <w:rPr>
+                <w:rFonts w:eastAsia="DengXian" w:cs="Times New Roman"/>
+                <w:sz w:val="18"/>
+                <w:szCs w:val="18"/>
+              </w:rPr>
+              <w:t>2</w:t>
+            </w:r>
+            <w:r>
+              <w:rPr>
+                <w:rFonts w:eastAsia="DengXian" w:cs="Times New Roman"/>
+                <w:sz w:val="18"/>
+                <w:szCs w:val="18"/>
+              </w:rPr>
+              <w:t>26.06</w:t>
             </w:r>
           </w:p>
         </w:tc>
@@ -3223,7 +3509,35 @@
           <w:sz w:val="22"/>
           <w:szCs w:val="22"/>
         </w:rPr>
-        <w:t xml:space="preserve"> The MLP models have very slight improvements thanks to faster data pipelining.</w:t>
+        <w:t xml:space="preserve"> The MLP models have very slight </w:t>
+      </w:r>
+      <w:r>
+        <w:rPr>
+          <w:sz w:val="22"/>
+          <w:szCs w:val="22"/>
+        </w:rPr>
+        <w:t xml:space="preserve">runtime improvements with the </w:t>
+      </w:r>
+      <w:r>
+        <w:rPr>
+          <w:sz w:val="22"/>
+          <w:szCs w:val="22"/>
+        </w:rPr>
+        <w:t>similar</w:t>
+      </w:r>
+      <w:r>
+        <w:rPr>
+          <w:sz w:val="22"/>
+          <w:szCs w:val="22"/>
+        </w:rPr>
+        <w:t xml:space="preserve"> forecasting results</w:t>
+      </w:r>
+      <w:r>
+        <w:rPr>
+          <w:sz w:val="22"/>
+          <w:szCs w:val="22"/>
+        </w:rPr>
+        <w:t xml:space="preserve">. </w:t>
       </w:r>
     </w:p>
     <w:p>
@@ -4138,7 +4452,21 @@
           <w:sz w:val="22"/>
           <w:szCs w:val="22"/>
         </w:rPr>
-        <w:t xml:space="preserve">Thanks to the selection of data points to remove </w:t>
+        <w:t xml:space="preserve">Thanks to the selection of </w:t>
+      </w:r>
+      <w:r>
+        <w:rPr>
+          <w:sz w:val="22"/>
+          <w:szCs w:val="22"/>
+        </w:rPr>
+        <w:t xml:space="preserve">suitable </w:t>
+      </w:r>
+      <w:r>
+        <w:rPr>
+          <w:sz w:val="22"/>
+          <w:szCs w:val="22"/>
+        </w:rPr>
+        <w:t xml:space="preserve">data points </w:t>
       </w:r>
       <w:r>
         <w:rPr>
@@ -4194,7 +4522,28 @@
           <w:sz w:val="22"/>
           <w:szCs w:val="22"/>
         </w:rPr>
-        <w:t>but errors remain large.</w:t>
+        <w:t>but</w:t>
+      </w:r>
+      <w:r>
+        <w:rPr>
+          <w:sz w:val="22"/>
+          <w:szCs w:val="22"/>
+        </w:rPr>
+        <w:t xml:space="preserve"> hourly</w:t>
+      </w:r>
+      <w:r>
+        <w:rPr>
+          <w:sz w:val="22"/>
+          <w:szCs w:val="22"/>
+        </w:rPr>
+        <w:t xml:space="preserve"> errors </w:t>
+      </w:r>
+      <w:r>
+        <w:rPr>
+          <w:sz w:val="22"/>
+          <w:szCs w:val="22"/>
+        </w:rPr>
+        <w:t>is worsened due to lack of fitting data, hence underfitting.</w:t>
       </w:r>
     </w:p>
     <w:p>
@@ -4265,7 +4614,14 @@
           <w:sz w:val="22"/>
           <w:szCs w:val="22"/>
         </w:rPr>
-        <w:t>es 6.81 J of energy, producing 0.00052 grams of CO2, which is negligible.</w:t>
+        <w:t xml:space="preserve">es 6.81 J of energy, producing 0.00052 grams of CO2, </w:t>
+      </w:r>
+      <w:r>
+        <w:rPr>
+          <w:sz w:val="22"/>
+          <w:szCs w:val="22"/>
+        </w:rPr>
+        <w:t>which are included in the energy used calculations.</w:t>
       </w:r>
     </w:p>
     <w:p>
@@ -5058,7 +5414,14 @@
           <w:sz w:val="22"/>
           <w:szCs w:val="22"/>
         </w:rPr>
-        <w:t>previous section.</w:t>
+        <w:t>previous section</w:t>
+      </w:r>
+      <w:r>
+        <w:rPr>
+          <w:sz w:val="22"/>
+          <w:szCs w:val="22"/>
+        </w:rPr>
+        <w:t>.</w:t>
       </w:r>
     </w:p>
     <w:p>
@@ -5087,6 +5450,7 @@
         <w:keepNext/>
       </w:pPr>
       <w:r>
+        <w:lastRenderedPageBreak/>
         <w:t xml:space="preserve">Table </w:t>
       </w:r>
       <w:fldSimple w:instr=" SEQ Table \* ARABIC ">
@@ -5109,9 +5473,9 @@
         <w:tblLook w:val="04A0" w:firstRow="1" w:lastRow="0" w:firstColumn="1" w:lastColumn="0" w:noHBand="0" w:noVBand="1"/>
       </w:tblPr>
       <w:tblGrid>
-        <w:gridCol w:w="1568"/>
-        <w:gridCol w:w="1426"/>
-        <w:gridCol w:w="2127"/>
+        <w:gridCol w:w="1658"/>
+        <w:gridCol w:w="1516"/>
+        <w:gridCol w:w="2217"/>
       </w:tblGrid>
       <w:tr>
         <w:trPr>
@@ -5119,20 +5483,20 @@
         </w:trPr>
         <w:tc>
           <w:tcPr>
-            <w:tcW w:w="0" w:type="auto"/>
-          </w:tcPr>
-          <w:p>
-            <w:pPr>
-              <w:rPr>
-                <w:sz w:val="18"/>
-                <w:szCs w:val="18"/>
-              </w:rPr>
-            </w:pPr>
-          </w:p>
-        </w:tc>
-        <w:tc>
-          <w:tcPr>
-            <w:tcW w:w="0" w:type="auto"/>
+            <w:tcW w:w="1658" w:type="dxa"/>
+          </w:tcPr>
+          <w:p>
+            <w:pPr>
+              <w:rPr>
+                <w:sz w:val="18"/>
+                <w:szCs w:val="18"/>
+              </w:rPr>
+            </w:pPr>
+          </w:p>
+        </w:tc>
+        <w:tc>
+          <w:tcPr>
+            <w:tcW w:w="1516" w:type="dxa"/>
           </w:tcPr>
           <w:p>
             <w:pPr>
@@ -5156,7 +5520,7 @@
         </w:tc>
         <w:tc>
           <w:tcPr>
-            <w:tcW w:w="0" w:type="auto"/>
+            <w:tcW w:w="2217" w:type="dxa"/>
           </w:tcPr>
           <w:p>
             <w:pPr>
@@ -5185,7 +5549,7 @@
         </w:trPr>
         <w:tc>
           <w:tcPr>
-            <w:tcW w:w="0" w:type="auto"/>
+            <w:tcW w:w="1658" w:type="dxa"/>
           </w:tcPr>
           <w:p>
             <w:pPr>
@@ -5209,7 +5573,7 @@
         </w:tc>
         <w:tc>
           <w:tcPr>
-            <w:tcW w:w="0" w:type="auto"/>
+            <w:tcW w:w="1516" w:type="dxa"/>
           </w:tcPr>
           <w:p>
             <w:pPr>
@@ -5229,7 +5593,7 @@
         </w:tc>
         <w:tc>
           <w:tcPr>
-            <w:tcW w:w="0" w:type="auto"/>
+            <w:tcW w:w="2217" w:type="dxa"/>
           </w:tcPr>
           <w:p>
             <w:pPr>
@@ -5254,7 +5618,7 @@
         </w:trPr>
         <w:tc>
           <w:tcPr>
-            <w:tcW w:w="0" w:type="auto"/>
+            <w:tcW w:w="1658" w:type="dxa"/>
           </w:tcPr>
           <w:p>
             <w:pPr>
@@ -5278,7 +5642,7 @@
         </w:tc>
         <w:tc>
           <w:tcPr>
-            <w:tcW w:w="0" w:type="auto"/>
+            <w:tcW w:w="1516" w:type="dxa"/>
           </w:tcPr>
           <w:p>
             <w:pPr>
@@ -5298,7 +5662,7 @@
         </w:tc>
         <w:tc>
           <w:tcPr>
-            <w:tcW w:w="0" w:type="auto"/>
+            <w:tcW w:w="2217" w:type="dxa"/>
           </w:tcPr>
           <w:p>
             <w:pPr>
@@ -5326,18 +5690,34 @@
           <w:szCs w:val="22"/>
         </w:rPr>
       </w:pPr>
-      <w:r>
-        <w:rPr>
-          <w:sz w:val="22"/>
-          <w:szCs w:val="22"/>
-        </w:rPr>
-        <w:t>The two environments use similar amount of energy and hence emit similar amounts of CO2.</w:t>
-      </w:r>
     </w:p>
     <w:p>
       <w:pPr>
         <w:spacing w:line="480" w:lineRule="auto"/>
         <w:rPr>
+          <w:sz w:val="22"/>
+          <w:szCs w:val="22"/>
+        </w:rPr>
+      </w:pPr>
+      <w:r>
+        <w:rPr>
+          <w:sz w:val="22"/>
+          <w:szCs w:val="22"/>
+        </w:rPr>
+        <w:t xml:space="preserve">Both </w:t>
+      </w:r>
+      <w:r>
+        <w:rPr>
+          <w:sz w:val="22"/>
+          <w:szCs w:val="22"/>
+        </w:rPr>
+        <w:t>environments use similar amount of energy and hence emit similar amounts of CO2.</w:t>
+      </w:r>
+    </w:p>
+    <w:p>
+      <w:pPr>
+        <w:spacing w:line="480" w:lineRule="auto"/>
+        <w:rPr>
           <w:b/>
           <w:bCs/>
           <w:sz w:val="22"/>
@@ -5360,7 +5740,6 @@
         <w:keepNext/>
       </w:pPr>
       <w:r>
-        <w:lastRenderedPageBreak/>
         <w:t xml:space="preserve">Table </w:t>
       </w:r>
       <w:fldSimple w:instr=" SEQ Table \* ARABIC ">
@@ -6033,7 +6412,7 @@
       <w:pPr>
         <w:numPr>
           <w:ilvl w:val="0"/>
-          <w:numId w:val="2"/>
+          <w:numId w:val="1"/>
         </w:numPr>
         <w:spacing w:line="480" w:lineRule="auto"/>
         <w:outlineLvl w:val="0"/>
@@ -6164,7 +6543,7 @@
       <w:pPr>
         <w:numPr>
           <w:ilvl w:val="0"/>
-          <w:numId w:val="2"/>
+          <w:numId w:val="1"/>
         </w:numPr>
         <w:spacing w:line="480" w:lineRule="auto"/>
         <w:outlineLvl w:val="0"/>
@@ -6423,7 +6802,7 @@
                 <w:sz w:val="18"/>
                 <w:szCs w:val="18"/>
               </w:rPr>
-              <w:t>IDE: visual studio code</w:t>
+              <w:t>visual studio code</w:t>
             </w:r>
           </w:p>
         </w:tc>
@@ -6434,7 +6813,7 @@
       <w:pPr>
         <w:numPr>
           <w:ilvl w:val="0"/>
-          <w:numId w:val="2"/>
+          <w:numId w:val="1"/>
         </w:numPr>
         <w:spacing w:line="480" w:lineRule="auto"/>
         <w:outlineLvl w:val="0"/>
@@ -6459,79 +6838,58 @@
     </w:p>
     <w:p>
       <w:pPr>
-        <w:spacing w:line="480" w:lineRule="auto"/>
+        <w:spacing w:line="240" w:lineRule="auto"/>
         <w:rPr>
           <w:i/>
           <w:iCs/>
-          <w:sz w:val="22"/>
-          <w:szCs w:val="22"/>
-        </w:rPr>
-      </w:pPr>
-      <w:r>
-        <w:rPr>
-          <w:sz w:val="22"/>
-          <w:szCs w:val="22"/>
-        </w:rPr>
-        <w:t xml:space="preserve">[1] </w:t>
-      </w:r>
-      <w:r>
-        <w:rPr>
-          <w:sz w:val="22"/>
-          <w:szCs w:val="22"/>
-        </w:rPr>
-        <w:t xml:space="preserve">NESO. (2023). </w:t>
+          <w:sz w:val="20"/>
+          <w:szCs w:val="20"/>
+        </w:rPr>
+      </w:pPr>
+      <w:r>
+        <w:rPr>
+          <w:sz w:val="20"/>
+          <w:szCs w:val="20"/>
+        </w:rPr>
+        <w:t xml:space="preserve">[1] NESO. (2023). </w:t>
       </w:r>
       <w:r>
         <w:rPr>
           <w:i/>
           <w:iCs/>
-          <w:sz w:val="22"/>
-          <w:szCs w:val="22"/>
+          <w:sz w:val="20"/>
+          <w:szCs w:val="20"/>
         </w:rPr>
         <w:t>Historic generation mix and carbon intensity</w:t>
       </w:r>
       <w:r>
         <w:rPr>
-          <w:sz w:val="22"/>
-          <w:szCs w:val="22"/>
-        </w:rPr>
-        <w:t xml:space="preserve">. Retrieved </w:t>
-      </w:r>
-      <w:r>
-        <w:rPr>
-          <w:sz w:val="22"/>
-          <w:szCs w:val="22"/>
-        </w:rPr>
-        <w:t>December 16</w:t>
-      </w:r>
-      <w:r>
-        <w:rPr>
-          <w:sz w:val="22"/>
-          <w:szCs w:val="22"/>
+          <w:sz w:val="20"/>
+          <w:szCs w:val="20"/>
+        </w:rPr>
+        <w:t>. Retrieved December 16</w:t>
+      </w:r>
+      <w:r>
+        <w:rPr>
+          <w:sz w:val="20"/>
+          <w:szCs w:val="20"/>
           <w:vertAlign w:val="superscript"/>
         </w:rPr>
         <w:t>th</w:t>
       </w:r>
       <w:r>
         <w:rPr>
-          <w:sz w:val="22"/>
-          <w:szCs w:val="22"/>
-        </w:rPr>
-        <w:t xml:space="preserve"> 2025</w:t>
-      </w:r>
-      <w:r>
-        <w:rPr>
-          <w:sz w:val="22"/>
-          <w:szCs w:val="22"/>
-        </w:rPr>
-        <w:t xml:space="preserve">, from </w:t>
+          <w:sz w:val="20"/>
+          <w:szCs w:val="20"/>
+        </w:rPr>
+        <w:t xml:space="preserve"> 2025, from </w:t>
       </w:r>
       <w:hyperlink r:id="rId11" w:history="1">
         <w:r>
           <w:rPr>
             <w:rStyle w:val="Hyperlink"/>
-            <w:sz w:val="22"/>
-            <w:szCs w:val="22"/>
+            <w:sz w:val="20"/>
+            <w:szCs w:val="20"/>
           </w:rPr>
           <w:t>https://www.neso.energy/data-portal/historic-generation-mix</w:t>
         </w:r>
@@ -6539,39 +6897,32 @@
     </w:p>
     <w:p>
       <w:pPr>
-        <w:spacing w:line="480" w:lineRule="auto"/>
-        <w:rPr>
-          <w:sz w:val="22"/>
-          <w:szCs w:val="22"/>
-        </w:rPr>
-      </w:pPr>
-      <w:r>
-        <w:rPr>
-          <w:sz w:val="22"/>
-          <w:szCs w:val="22"/>
-        </w:rPr>
-        <w:t xml:space="preserve">[2] </w:t>
-      </w:r>
-      <w:r>
-        <w:rPr>
-          <w:sz w:val="22"/>
-          <w:szCs w:val="22"/>
-        </w:rPr>
-        <w:t xml:space="preserve">NESO. (2023). </w:t>
+        <w:spacing w:line="240" w:lineRule="auto"/>
+        <w:rPr>
+          <w:sz w:val="20"/>
+          <w:szCs w:val="20"/>
+        </w:rPr>
+      </w:pPr>
+      <w:r>
+        <w:rPr>
+          <w:sz w:val="20"/>
+          <w:szCs w:val="20"/>
+        </w:rPr>
+        <w:t xml:space="preserve">[2] NESO. (2023). </w:t>
       </w:r>
       <w:r>
         <w:rPr>
           <w:i/>
           <w:iCs/>
-          <w:sz w:val="22"/>
-          <w:szCs w:val="22"/>
+          <w:sz w:val="20"/>
+          <w:szCs w:val="20"/>
         </w:rPr>
         <w:t>Carbon Intensity API</w:t>
       </w:r>
       <w:r>
         <w:rPr>
-          <w:sz w:val="22"/>
-          <w:szCs w:val="22"/>
+          <w:sz w:val="20"/>
+          <w:szCs w:val="20"/>
         </w:rPr>
         <w:t xml:space="preserve">. from </w:t>
       </w:r>
@@ -6579,8 +6930,8 @@
         <w:r>
           <w:rPr>
             <w:rStyle w:val="Hyperlink"/>
-            <w:sz w:val="22"/>
-            <w:szCs w:val="22"/>
+            <w:sz w:val="20"/>
+            <w:szCs w:val="20"/>
           </w:rPr>
           <w:t>https://carbonintensity.org.uk/</w:t>
         </w:r>
@@ -6588,62 +6939,110 @@
     </w:p>
     <w:p>
       <w:pPr>
-        <w:spacing w:line="480" w:lineRule="auto"/>
-        <w:rPr>
-          <w:sz w:val="22"/>
-          <w:szCs w:val="22"/>
-        </w:rPr>
-      </w:pPr>
-      <w:r>
-        <w:rPr>
-          <w:sz w:val="22"/>
-          <w:szCs w:val="22"/>
+        <w:spacing w:line="240" w:lineRule="auto"/>
+        <w:rPr>
+          <w:sz w:val="20"/>
+          <w:szCs w:val="20"/>
+        </w:rPr>
+      </w:pPr>
+      <w:r>
+        <w:rPr>
+          <w:sz w:val="20"/>
+          <w:szCs w:val="20"/>
         </w:rPr>
         <w:t>[3]</w:t>
       </w:r>
       <w:r>
         <w:rPr>
-          <w:sz w:val="22"/>
-          <w:szCs w:val="22"/>
+          <w:sz w:val="20"/>
+          <w:szCs w:val="20"/>
         </w:rPr>
         <w:t xml:space="preserve"> </w:t>
       </w:r>
       <w:r>
         <w:rPr>
-          <w:sz w:val="22"/>
-          <w:szCs w:val="22"/>
-        </w:rPr>
-        <w:t xml:space="preserve">T. G. Smith </w:t>
-      </w:r>
-      <w:r>
-        <w:rPr>
-          <w:i/>
-          <w:iCs/>
-          <w:sz w:val="22"/>
-          <w:szCs w:val="22"/>
-        </w:rPr>
-        <w:t>et al.</w:t>
-      </w:r>
-      <w:r>
-        <w:rPr>
-          <w:sz w:val="22"/>
-          <w:szCs w:val="22"/>
-        </w:rPr>
-        <w:t>, "pmdarima: ARIMA estimators for Python," version 2.0.4, 2017.</w:t>
-      </w:r>
-      <w:r>
-        <w:rPr>
-          <w:sz w:val="22"/>
-          <w:szCs w:val="22"/>
-        </w:rPr>
-        <w:t xml:space="preserve">from </w:t>
+          <w:sz w:val="20"/>
+          <w:szCs w:val="20"/>
+        </w:rPr>
+        <w:t>LibreHardwareMonitor, version 0.9.3,</w:t>
+      </w:r>
+      <w:r>
+        <w:rPr>
+          <w:sz w:val="20"/>
+          <w:szCs w:val="20"/>
+        </w:rPr>
+        <w:t xml:space="preserve"> </w:t>
       </w:r>
       <w:hyperlink r:id="rId13" w:tgtFrame="_blank" w:history="1">
         <w:r>
           <w:rPr>
             <w:rStyle w:val="Hyperlink"/>
-            <w:sz w:val="22"/>
-            <w:szCs w:val="22"/>
+            <w:sz w:val="20"/>
+            <w:szCs w:val="20"/>
+          </w:rPr>
+          <w:t>https:/</w:t>
+        </w:r>
+        <w:r>
+          <w:rPr>
+            <w:rStyle w:val="Hyperlink"/>
+            <w:sz w:val="20"/>
+            <w:szCs w:val="20"/>
+          </w:rPr>
+          <w:t>github.com/LibreHardwareMonitor/LibreHardwareMonitor</w:t>
+        </w:r>
+      </w:hyperlink>
+    </w:p>
+    <w:p>
+      <w:pPr>
+        <w:spacing w:line="240" w:lineRule="auto"/>
+        <w:rPr>
+          <w:sz w:val="20"/>
+          <w:szCs w:val="20"/>
+        </w:rPr>
+      </w:pPr>
+      <w:r>
+        <w:rPr>
+          <w:sz w:val="20"/>
+          <w:szCs w:val="20"/>
+        </w:rPr>
+        <w:t>[</w:t>
+      </w:r>
+      <w:r>
+        <w:rPr>
+          <w:sz w:val="20"/>
+          <w:szCs w:val="20"/>
+        </w:rPr>
+        <w:t>4</w:t>
+      </w:r>
+      <w:r>
+        <w:rPr>
+          <w:sz w:val="20"/>
+          <w:szCs w:val="20"/>
+        </w:rPr>
+        <w:t xml:space="preserve">] T. G. Smith </w:t>
+      </w:r>
+      <w:r>
+        <w:rPr>
+          <w:i/>
+          <w:iCs/>
+          <w:sz w:val="20"/>
+          <w:szCs w:val="20"/>
+        </w:rPr>
+        <w:t>et al.</w:t>
+      </w:r>
+      <w:r>
+        <w:rPr>
+          <w:sz w:val="20"/>
+          <w:szCs w:val="20"/>
+        </w:rPr>
+        <w:t xml:space="preserve">, "pmdarima: ARIMA estimators for Python," version 2.0.4, 2017.from </w:t>
+      </w:r>
+      <w:hyperlink r:id="rId14" w:tgtFrame="_blank" w:history="1">
+        <w:r>
+          <w:rPr>
+            <w:rStyle w:val="Hyperlink"/>
+            <w:sz w:val="20"/>
+            <w:szCs w:val="20"/>
           </w:rPr>
           <w:t>http://alkaline-ml.com/pmdarima</w:t>
         </w:r>
@@ -6651,39 +7050,46 @@
     </w:p>
     <w:p>
       <w:pPr>
-        <w:spacing w:line="480" w:lineRule="auto"/>
-        <w:rPr>
-          <w:sz w:val="22"/>
-          <w:szCs w:val="22"/>
-        </w:rPr>
-      </w:pPr>
-      <w:r>
-        <w:rPr>
-          <w:sz w:val="22"/>
-          <w:szCs w:val="22"/>
-        </w:rPr>
-        <w:t xml:space="preserve">[4] </w:t>
-      </w:r>
-      <w:r>
-        <w:rPr>
-          <w:sz w:val="22"/>
-          <w:szCs w:val="22"/>
-        </w:rPr>
-        <w:t xml:space="preserve">F. Pedregosa </w:t>
+        <w:spacing w:line="240" w:lineRule="auto"/>
+        <w:rPr>
+          <w:sz w:val="20"/>
+          <w:szCs w:val="20"/>
+        </w:rPr>
+      </w:pPr>
+      <w:r>
+        <w:rPr>
+          <w:sz w:val="20"/>
+          <w:szCs w:val="20"/>
+        </w:rPr>
+        <w:t>[</w:t>
+      </w:r>
+      <w:r>
+        <w:rPr>
+          <w:sz w:val="20"/>
+          <w:szCs w:val="20"/>
+        </w:rPr>
+        <w:t>5</w:t>
+      </w:r>
+      <w:r>
+        <w:rPr>
+          <w:sz w:val="20"/>
+          <w:szCs w:val="20"/>
+        </w:rPr>
+        <w:t xml:space="preserve">] F. Pedregosa </w:t>
       </w:r>
       <w:r>
         <w:rPr>
           <w:i/>
           <w:iCs/>
-          <w:sz w:val="22"/>
-          <w:szCs w:val="22"/>
+          <w:sz w:val="20"/>
+          <w:szCs w:val="20"/>
         </w:rPr>
         <w:t>et al.</w:t>
       </w:r>
       <w:r>
         <w:rPr>
-          <w:sz w:val="22"/>
-          <w:szCs w:val="22"/>
+          <w:sz w:val="20"/>
+          <w:szCs w:val="20"/>
         </w:rPr>
         <w:t xml:space="preserve">, "Scikit-learn: Machine learning in Python," </w:t>
       </w:r>
@@ -6691,70 +7097,111 @@
         <w:rPr>
           <w:i/>
           <w:iCs/>
-          <w:sz w:val="22"/>
-          <w:szCs w:val="22"/>
+          <w:sz w:val="20"/>
+          <w:szCs w:val="20"/>
         </w:rPr>
         <w:t>J. Mach. Learn. Res.</w:t>
       </w:r>
       <w:r>
         <w:rPr>
-          <w:sz w:val="22"/>
-          <w:szCs w:val="22"/>
+          <w:sz w:val="20"/>
+          <w:szCs w:val="20"/>
         </w:rPr>
         <w:t>, vol. 12, pp. 2825–2830, 2011.</w:t>
       </w:r>
     </w:p>
     <w:p>
       <w:pPr>
-        <w:spacing w:line="480" w:lineRule="auto"/>
+        <w:spacing w:line="240" w:lineRule="auto"/>
+        <w:rPr>
+          <w:sz w:val="20"/>
+          <w:szCs w:val="20"/>
+        </w:rPr>
+      </w:pPr>
+      <w:r>
+        <w:rPr>
+          <w:sz w:val="20"/>
+          <w:szCs w:val="20"/>
+        </w:rPr>
+        <w:t>[</w:t>
+      </w:r>
+      <w:r>
+        <w:rPr>
+          <w:sz w:val="20"/>
+          <w:szCs w:val="20"/>
+        </w:rPr>
+        <w:t>6</w:t>
+      </w:r>
+      <w:r>
+        <w:rPr>
+          <w:sz w:val="20"/>
+          <w:szCs w:val="20"/>
+        </w:rPr>
+        <w:t xml:space="preserve">] </w:t>
+      </w:r>
+      <w:r>
+        <w:rPr>
+          <w:sz w:val="20"/>
+          <w:szCs w:val="20"/>
+        </w:rPr>
+        <w:t xml:space="preserve">P. Virtanen </w:t>
+      </w:r>
+      <w:r>
+        <w:rPr>
+          <w:i/>
+          <w:iCs/>
+          <w:sz w:val="20"/>
+          <w:szCs w:val="20"/>
+        </w:rPr>
+        <w:t>et al.</w:t>
+      </w:r>
+      <w:r>
+        <w:rPr>
+          <w:sz w:val="20"/>
+          <w:szCs w:val="20"/>
+        </w:rPr>
+        <w:t xml:space="preserve">, "SciPy 1.0: fundamental algorithms for scientific computing in Python," </w:t>
+      </w:r>
+      <w:r>
+        <w:rPr>
+          <w:i/>
+          <w:iCs/>
+          <w:sz w:val="20"/>
+          <w:szCs w:val="20"/>
+        </w:rPr>
+        <w:t>Nat. Methods</w:t>
+      </w:r>
+      <w:r>
+        <w:rPr>
+          <w:sz w:val="20"/>
+          <w:szCs w:val="20"/>
+        </w:rPr>
+        <w:t>, vol. 17, no. 3, pp. 261–272, 2020.</w:t>
+      </w:r>
+    </w:p>
+    <w:p>
+      <w:pPr>
+        <w:pStyle w:val="Heading1"/>
         <w:rPr>
           <w:b/>
           <w:bCs/>
-          <w:sz w:val="22"/>
-          <w:szCs w:val="22"/>
-        </w:rPr>
-      </w:pPr>
+        </w:rPr>
+      </w:pPr>
+      <w:r>
+        <w:rPr>
+          <w:b/>
+          <w:bCs/>
+        </w:rPr>
+        <w:lastRenderedPageBreak/>
+        <w:t>Appendix</w:t>
+      </w:r>
     </w:p>
     <w:p>
-      <w:pPr>
-        <w:spacing w:line="480" w:lineRule="auto"/>
-        <w:rPr>
-          <w:b/>
-          <w:bCs/>
-          <w:sz w:val="22"/>
-          <w:szCs w:val="22"/>
-        </w:rPr>
-      </w:pPr>
-    </w:p>
-    <w:p>
-      <w:pPr>
-        <w:spacing w:line="480" w:lineRule="auto"/>
-        <w:rPr>
-          <w:b/>
-          <w:bCs/>
-          <w:sz w:val="22"/>
-          <w:szCs w:val="22"/>
-        </w:rPr>
-      </w:pPr>
-    </w:p>
-    <w:p>
-      <w:pPr>
-        <w:pStyle w:val="Heading1"/>
-      </w:pPr>
-      <w:r>
-        <w:lastRenderedPageBreak/>
-        <w:t>Appendix</w:t>
-      </w:r>
-    </w:p>
-    <w:p>
       <w:r>
         <w:t>Code GitHub URL:</w:t>
       </w:r>
       <w:r>
-        <w:t xml:space="preserve"> </w:t>
-      </w:r>
-      <w:r>
-        <w:t>https://github.com/CalvoSeko/sustainable-computing-coursework-tianwei</w:t>
+        <w:t xml:space="preserve"> https://github.com/CalvoSeko/sustainable-computing-coursework-tianwei</w:t>
       </w:r>
     </w:p>
     <w:p>
@@ -6788,7 +7235,7 @@
                     <pic:cNvPicPr/>
                   </pic:nvPicPr>
                   <pic:blipFill>
-                    <a:blip r:embed="rId14"/>
+                    <a:blip r:embed="rId15"/>
                     <a:stretch>
                       <a:fillRect/>
                     </a:stretch>
@@ -6838,7 +7285,7 @@
                     <pic:cNvPicPr/>
                   </pic:nvPicPr>
                   <pic:blipFill>
-                    <a:blip r:embed="rId15"/>
+                    <a:blip r:embed="rId16"/>
                     <a:stretch>
                       <a:fillRect/>
                     </a:stretch>
@@ -6896,9 +7343,9 @@
           <w:szCs w:val="18"/>
         </w:rPr>
         <w:drawing>
-          <wp:inline distT="0" distB="0" distL="0" distR="0" wp14:anchorId="04336CFB" wp14:editId="43E87907">
-            <wp:extent cx="2657175" cy="1339186"/>
-            <wp:effectExtent l="0" t="0" r="0" b="0"/>
+          <wp:inline distT="0" distB="0" distL="0" distR="0" wp14:anchorId="04336CFB" wp14:editId="2F90908F">
+            <wp:extent cx="4446676" cy="2241073"/>
+            <wp:effectExtent l="0" t="0" r="0" b="6985"/>
             <wp:docPr id="261786111" name="Picture 1" descr="A graph showing a graph of carbon&#10;&#10;AI-generated content may be incorrect."/>
             <wp:cNvGraphicFramePr>
               <a:graphicFrameLocks xmlns:a="http://schemas.openxmlformats.org/drawingml/2006/main" noChangeAspect="1"/>
@@ -6911,7 +7358,7 @@
                     <pic:cNvPicPr/>
                   </pic:nvPicPr>
                   <pic:blipFill>
-                    <a:blip r:embed="rId16"/>
+                    <a:blip r:embed="rId17"/>
                     <a:stretch>
                       <a:fillRect/>
                     </a:stretch>
@@ -6919,7 +7366,7 @@
                   <pic:spPr>
                     <a:xfrm>
                       <a:off x="0" y="0"/>
-                      <a:ext cx="2709065" cy="1365338"/>
+                      <a:ext cx="4565673" cy="2301046"/>
                     </a:xfrm>
                     <a:prstGeom prst="rect">
                       <a:avLst/>
@@ -6940,8 +7387,8 @@
           <w:szCs w:val="18"/>
         </w:rPr>
         <w:drawing>
-          <wp:inline distT="0" distB="0" distL="0" distR="0" wp14:anchorId="4877E2F3" wp14:editId="3A4A6336">
-            <wp:extent cx="3039191" cy="1341472"/>
+          <wp:inline distT="0" distB="0" distL="0" distR="0" wp14:anchorId="4877E2F3" wp14:editId="5D589CB2">
+            <wp:extent cx="4706077" cy="2077221"/>
             <wp:effectExtent l="0" t="0" r="0" b="0"/>
             <wp:docPr id="1740916847" name="Picture 1" descr="A graph showing red lines&#10;&#10;AI-generated content may be incorrect."/>
             <wp:cNvGraphicFramePr>
@@ -6955,7 +7402,7 @@
                     <pic:cNvPicPr/>
                   </pic:nvPicPr>
                   <pic:blipFill>
-                    <a:blip r:embed="rId17"/>
+                    <a:blip r:embed="rId18"/>
                     <a:stretch>
                       <a:fillRect/>
                     </a:stretch>
@@ -6963,7 +7410,7 @@
                   <pic:spPr>
                     <a:xfrm>
                       <a:off x="0" y="0"/>
-                      <a:ext cx="3063380" cy="1352149"/>
+                      <a:ext cx="4763705" cy="2102658"/>
                     </a:xfrm>
                     <a:prstGeom prst="rect">
                       <a:avLst/>
@@ -7028,7 +7475,7 @@
                     <pic:cNvPicPr/>
                   </pic:nvPicPr>
                   <pic:blipFill>
-                    <a:blip r:embed="rId18"/>
+                    <a:blip r:embed="rId19"/>
                     <a:stretch>
                       <a:fillRect/>
                     </a:stretch>
@@ -7086,6 +7533,7 @@
           <w:sz w:val="18"/>
           <w:szCs w:val="18"/>
         </w:rPr>
+        <w:lastRenderedPageBreak/>
         <w:drawing>
           <wp:inline distT="0" distB="0" distL="0" distR="0" wp14:anchorId="4676AAA0" wp14:editId="517C894D">
             <wp:extent cx="2645521" cy="1440000"/>
@@ -7102,7 +7550,7 @@
                     <pic:cNvPicPr/>
                   </pic:nvPicPr>
                   <pic:blipFill>
-                    <a:blip r:embed="rId19"/>
+                    <a:blip r:embed="rId20"/>
                     <a:stretch>
                       <a:fillRect/>
                     </a:stretch>
@@ -7152,7 +7600,7 @@
                     <pic:cNvPicPr/>
                   </pic:nvPicPr>
                   <pic:blipFill>
-                    <a:blip r:embed="rId20"/>
+                    <a:blip r:embed="rId21"/>
                     <a:stretch>
                       <a:fillRect/>
                     </a:stretch>
@@ -7211,7 +7659,6 @@
           <w:sz w:val="18"/>
           <w:szCs w:val="18"/>
         </w:rPr>
-        <w:lastRenderedPageBreak/>
         <w:drawing>
           <wp:inline distT="0" distB="0" distL="0" distR="0" wp14:anchorId="43F92F28" wp14:editId="4992F0FD">
             <wp:extent cx="4154442" cy="1833735"/>
@@ -7228,7 +7675,7 @@
                     <pic:cNvPicPr/>
                   </pic:nvPicPr>
                   <pic:blipFill>
-                    <a:blip r:embed="rId21"/>
+                    <a:blip r:embed="rId22"/>
                     <a:stretch>
                       <a:fillRect/>
                     </a:stretch>
@@ -7301,7 +7748,7 @@
                     <pic:cNvPicPr/>
                   </pic:nvPicPr>
                   <pic:blipFill>
-                    <a:blip r:embed="rId22"/>
+                    <a:blip r:embed="rId23"/>
                     <a:stretch>
                       <a:fillRect/>
                     </a:stretch>
@@ -7373,7 +7820,7 @@
                     <pic:cNvPicPr/>
                   </pic:nvPicPr>
                   <pic:blipFill rotWithShape="1">
-                    <a:blip r:embed="rId23"/>
+                    <a:blip r:embed="rId24"/>
                     <a:srcRect l="800" r="1257"/>
                     <a:stretch>
                       <a:fillRect/>
@@ -7424,7 +7871,7 @@
                     <pic:cNvPicPr/>
                   </pic:nvPicPr>
                   <pic:blipFill rotWithShape="1">
-                    <a:blip r:embed="rId24"/>
+                    <a:blip r:embed="rId25"/>
                     <a:srcRect l="1013" r="764"/>
                     <a:stretch>
                       <a:fillRect/>
@@ -7462,27 +7909,14 @@
       <w:r>
         <w:t xml:space="preserve">Figure </w:t>
       </w:r>
-      <w:r>
-        <w:fldChar w:fldCharType="begin"/>
-      </w:r>
-      <w:r>
-        <w:instrText xml:space="preserve"> SEQ Figure \* ARABIC </w:instrText>
-      </w:r>
-      <w:r>
-        <w:fldChar w:fldCharType="separate"/>
-      </w:r>
-      <w:r>
-        <w:rPr>
-          <w:noProof/>
-        </w:rPr>
-        <w:t>11</w:t>
-      </w:r>
-      <w:r>
-        <w:rPr>
-          <w:noProof/>
-        </w:rPr>
-        <w:fldChar w:fldCharType="end"/>
-      </w:r>
+      <w:fldSimple w:instr=" SEQ Figure \* ARABIC ">
+        <w:r>
+          <w:rPr>
+            <w:noProof/>
+          </w:rPr>
+          <w:t>11</w:t>
+        </w:r>
+      </w:fldSimple>
       <w:r>
         <w:rPr>
           <w:noProof/>
@@ -7509,9 +7943,10 @@
           <w:sz w:val="18"/>
           <w:szCs w:val="18"/>
         </w:rPr>
+        <w:lastRenderedPageBreak/>
         <w:drawing>
-          <wp:inline distT="0" distB="0" distL="0" distR="0" wp14:anchorId="4BFDC581" wp14:editId="618EC864">
-            <wp:extent cx="3018049" cy="1262241"/>
+          <wp:inline distT="0" distB="0" distL="0" distR="0" wp14:anchorId="4BFDC581" wp14:editId="4C682604">
+            <wp:extent cx="5611216" cy="2346784"/>
             <wp:effectExtent l="0" t="0" r="0" b="0"/>
             <wp:docPr id="882358553" name="Picture 1" descr="A graph showing a graph of red lines&#10;&#10;AI-generated content may be incorrect."/>
             <wp:cNvGraphicFramePr>
@@ -7525,7 +7960,7 @@
                     <pic:cNvPicPr/>
                   </pic:nvPicPr>
                   <pic:blipFill>
-                    <a:blip r:embed="rId25"/>
+                    <a:blip r:embed="rId26"/>
                     <a:stretch>
                       <a:fillRect/>
                     </a:stretch>
@@ -7533,7 +7968,7 @@
                   <pic:spPr>
                     <a:xfrm>
                       <a:off x="0" y="0"/>
-                      <a:ext cx="3051769" cy="1276344"/>
+                      <a:ext cx="5720727" cy="2392585"/>
                     </a:xfrm>
                     <a:prstGeom prst="rect">
                       <a:avLst/>
@@ -7552,9 +7987,9 @@
           <w:szCs w:val="18"/>
         </w:rPr>
         <w:drawing>
-          <wp:inline distT="0" distB="0" distL="0" distR="0" wp14:anchorId="3DAA9F10" wp14:editId="55A4F085">
-            <wp:extent cx="2674488" cy="1190160"/>
-            <wp:effectExtent l="0" t="0" r="0" b="0"/>
+          <wp:inline distT="0" distB="0" distL="0" distR="0" wp14:anchorId="3DAA9F10" wp14:editId="018639DE">
+            <wp:extent cx="5641815" cy="2510636"/>
+            <wp:effectExtent l="0" t="0" r="0" b="4445"/>
             <wp:docPr id="1893185160" name="Picture 1" descr="A graph showing a graph&#10;&#10;AI-generated content may be incorrect."/>
             <wp:cNvGraphicFramePr>
               <a:graphicFrameLocks xmlns:a="http://schemas.openxmlformats.org/drawingml/2006/main" noChangeAspect="1"/>
@@ -7567,7 +8002,7 @@
                     <pic:cNvPicPr/>
                   </pic:nvPicPr>
                   <pic:blipFill>
-                    <a:blip r:embed="rId26"/>
+                    <a:blip r:embed="rId27"/>
                     <a:stretch>
                       <a:fillRect/>
                     </a:stretch>
@@ -7575,7 +8010,7 @@
                   <pic:spPr>
                     <a:xfrm>
                       <a:off x="0" y="0"/>
-                      <a:ext cx="2718399" cy="1209701"/>
+                      <a:ext cx="5783557" cy="2573712"/>
                     </a:xfrm>
                     <a:prstGeom prst="rect">
                       <a:avLst/>
@@ -7596,27 +8031,14 @@
       <w:r>
         <w:t xml:space="preserve">Figure </w:t>
       </w:r>
-      <w:r>
-        <w:fldChar w:fldCharType="begin"/>
-      </w:r>
-      <w:r>
-        <w:instrText xml:space="preserve"> SEQ Figure \* ARABIC </w:instrText>
-      </w:r>
-      <w:r>
-        <w:fldChar w:fldCharType="separate"/>
-      </w:r>
-      <w:r>
-        <w:rPr>
-          <w:noProof/>
-        </w:rPr>
-        <w:t>14</w:t>
-      </w:r>
-      <w:r>
-        <w:rPr>
-          <w:noProof/>
-        </w:rPr>
-        <w:fldChar w:fldCharType="end"/>
-      </w:r>
+      <w:fldSimple w:instr=" SEQ Figure \* ARABIC ">
+        <w:r>
+          <w:rPr>
+            <w:noProof/>
+          </w:rPr>
+          <w:t>14</w:t>
+        </w:r>
+      </w:fldSimple>
       <w:r>
         <w:t xml:space="preserve"> </w:t>
       </w:r>
@@ -7639,7 +8061,7 @@
       </w:pPr>
     </w:p>
     <w:sectPr>
-      <w:footerReference w:type="default" r:id="rId27"/>
+      <w:footerReference w:type="default" r:id="rId28"/>
       <w:pgSz w:w="11906" w:h="16838"/>
       <w:pgMar w:top="1134" w:right="1134" w:bottom="1134" w:left="1134" w:header="709" w:footer="709" w:gutter="0"/>
       <w:cols w:space="708"/>
@@ -8633,7 +9055,6 @@
     <w:next w:val="Normal"/>
     <w:link w:val="Heading3Char"/>
     <w:uiPriority w:val="9"/>
-    <w:semiHidden/>
     <w:unhideWhenUsed/>
     <w:qFormat/>
     <w:rsid w:val="00C605C4"/>
@@ -8871,7 +9292,6 @@
     <w:basedOn w:val="DefaultParagraphFont"/>
     <w:link w:val="Heading3"/>
     <w:uiPriority w:val="9"/>
-    <w:semiHidden/>
     <w:rsid w:val="00C605C4"/>
     <w:rPr>
       <w:rFonts w:eastAsiaTheme="majorEastAsia" w:cstheme="majorBidi"/>
@@ -9703,12 +10123,7 @@
 </file>
 
 <file path=customXml/item2.xml><?xml version="1.0" encoding="utf-8"?>
-<?mso-contentType ?>
-<FormTemplates xmlns="http://schemas.microsoft.com/sharepoint/v3/contenttype/forms">
-  <Display>DocumentLibraryForm</Display>
-  <Edit>DocumentLibraryForm</Edit>
-  <New>DocumentLibraryForm</New>
-</FormTemplates>
+<b:Sources xmlns:b="http://schemas.openxmlformats.org/officeDocument/2006/bibliography" xmlns="http://schemas.openxmlformats.org/officeDocument/2006/bibliography" SelectedStyle="\APASixthEditionOfficeOnline.xsl" StyleName="APA" Version="6"/>
 </file>
 
 <file path=customXml/item3.xml><?xml version="1.0" encoding="utf-8"?>
@@ -9720,7 +10135,12 @@
 </file>
 
 <file path=customXml/item4.xml><?xml version="1.0" encoding="utf-8"?>
-<b:Sources xmlns:b="http://schemas.openxmlformats.org/officeDocument/2006/bibliography" xmlns="http://schemas.openxmlformats.org/officeDocument/2006/bibliography" SelectedStyle="\APASixthEditionOfficeOnline.xsl" StyleName="APA" Version="6"/>
+<?mso-contentType ?>
+<FormTemplates xmlns="http://schemas.microsoft.com/sharepoint/v3/contenttype/forms">
+  <Display>DocumentLibraryForm</Display>
+  <Edit>DocumentLibraryForm</Edit>
+  <New>DocumentLibraryForm</New>
+</FormTemplates>
 </file>
 
 <file path=customXml/itemProps1.xml><?xml version="1.0" encoding="utf-8"?>
@@ -9742,9 +10162,9 @@
 </file>
 
 <file path=customXml/itemProps2.xml><?xml version="1.0" encoding="utf-8"?>
-<ds:datastoreItem xmlns:ds="http://schemas.openxmlformats.org/officeDocument/2006/customXml" ds:itemID="{4C7D51D5-356B-4573-8779-8C1B1F996988}">
+<ds:datastoreItem xmlns:ds="http://schemas.openxmlformats.org/officeDocument/2006/customXml" ds:itemID="{0B0F0970-1F50-451F-928D-8EB91EC6BECB}">
   <ds:schemaRefs>
-    <ds:schemaRef ds:uri="http://schemas.microsoft.com/sharepoint/v3/contenttype/forms"/>
+    <ds:schemaRef ds:uri="http://schemas.openxmlformats.org/officeDocument/2006/bibliography"/>
   </ds:schemaRefs>
 </ds:datastoreItem>
 </file>
@@ -9760,9 +10180,9 @@
 </file>
 
 <file path=customXml/itemProps4.xml><?xml version="1.0" encoding="utf-8"?>
-<ds:datastoreItem xmlns:ds="http://schemas.openxmlformats.org/officeDocument/2006/customXml" ds:itemID="{0B0F0970-1F50-451F-928D-8EB91EC6BECB}">
+<ds:datastoreItem xmlns:ds="http://schemas.openxmlformats.org/officeDocument/2006/customXml" ds:itemID="{4C7D51D5-356B-4573-8779-8C1B1F996988}">
   <ds:schemaRefs>
-    <ds:schemaRef ds:uri="http://schemas.openxmlformats.org/officeDocument/2006/bibliography"/>
+    <ds:schemaRef ds:uri="http://schemas.microsoft.com/sharepoint/v3/contenttype/forms"/>
   </ds:schemaRefs>
 </ds:datastoreItem>
 </file>
</xml_diff>